<commit_message>
Refactor protocol document generation and enhance data handling
- Updated the protocol document template to improve the structure of inspection results and commission member listings.
- Refactored the API to load commission member names with additional context for document generation.
- Removed obsolete manual admission classes and tests to streamline the codebase.
- Added new utility functions for formatting admission data in documents, enhancing clarity and consistency.
- Improved test coverage for admission scope formatting functions, ensuring accurate output for various scenarios.
</commit_message>
<xml_diff>
--- a/forms/protocol.docx
+++ b/forms/protocol.docx
@@ -8,8 +8,8 @@
         <w:rPr>
           <w:b/>
           <w:bCs/>
-          <w:sz w:val="32"/>
-          <w:szCs w:val="32"/>
+          <w:sz w:val="28"/>
+          <w:szCs w:val="28"/>
           <w:lang w:val="en-US"/>
         </w:rPr>
       </w:pPr>
@@ -17,8 +17,8 @@
         <w:rPr>
           <w:b/>
           <w:bCs/>
-          <w:sz w:val="32"/>
-          <w:szCs w:val="32"/>
+          <w:sz w:val="28"/>
+          <w:szCs w:val="28"/>
           <w:lang w:val="uk-UA"/>
         </w:rPr>
         <w:t>Протокол</w:t>
@@ -27,8 +27,8 @@
         <w:rPr>
           <w:b/>
           <w:bCs/>
-          <w:sz w:val="32"/>
-          <w:szCs w:val="32"/>
+          <w:sz w:val="28"/>
+          <w:szCs w:val="28"/>
           <w:lang w:val="en-US"/>
         </w:rPr>
         <w:t xml:space="preserve"> №{protocol-number}</w:t>
@@ -38,15 +38,15 @@
       <w:pPr>
         <w:jc w:val="center"/>
         <w:rPr>
-          <w:sz w:val="24"/>
-          <w:szCs w:val="24"/>
+          <w:sz w:val="22"/>
+          <w:szCs w:val="22"/>
           <w:lang w:val="en-US"/>
         </w:rPr>
       </w:pPr>
       <w:r>
         <w:rPr>
-          <w:sz w:val="24"/>
-          <w:szCs w:val="24"/>
+          <w:sz w:val="22"/>
+          <w:szCs w:val="22"/>
           <w:lang w:val="uk-UA"/>
         </w:rPr>
         <w:t>засідання атестаційної комісії</w:t>
@@ -56,27 +56,49 @@
       <w:pPr>
         <w:jc w:val="right"/>
         <w:rPr>
-          <w:sz w:val="24"/>
-          <w:szCs w:val="24"/>
-          <w:lang w:val="uk-UA"/>
-        </w:rPr>
-      </w:pPr>
-      <w:r>
-        <w:rPr>
-          <w:b/>
-          <w:bCs/>
-          <w:sz w:val="24"/>
-          <w:szCs w:val="24"/>
-          <w:lang w:val="uk-UA"/>
-        </w:rPr>
-        <w:t>від {protocol-date}</w:t>
+          <w:sz w:val="22"/>
+          <w:szCs w:val="22"/>
+          <w:lang w:val="uk-UA"/>
+        </w:rPr>
+      </w:pPr>
+      <w:r>
+        <w:rPr>
+          <w:b/>
+          <w:bCs/>
+          <w:sz w:val="22"/>
+          <w:szCs w:val="22"/>
+          <w:lang w:val="uk-UA"/>
+        </w:rPr>
+        <w:t>від {</w:t>
+      </w:r>
+      <w:proofErr w:type="spellStart"/>
+      <w:r>
+        <w:rPr>
+          <w:b/>
+          <w:bCs/>
+          <w:sz w:val="22"/>
+          <w:szCs w:val="22"/>
+          <w:lang w:val="uk-UA"/>
+        </w:rPr>
+        <w:t>protocol-date</w:t>
+      </w:r>
+      <w:proofErr w:type="spellEnd"/>
+      <w:r>
+        <w:rPr>
+          <w:b/>
+          <w:bCs/>
+          <w:sz w:val="22"/>
+          <w:szCs w:val="22"/>
+          <w:lang w:val="uk-UA"/>
+        </w:rPr>
+        <w:t>}</w:t>
       </w:r>
     </w:p>
     <w:p>
       <w:pPr>
         <w:rPr>
-          <w:sz w:val="12"/>
-          <w:szCs w:val="12"/>
+          <w:sz w:val="10"/>
+          <w:szCs w:val="10"/>
           <w:lang w:val="uk-UA"/>
         </w:rPr>
       </w:pPr>
@@ -84,15 +106,15 @@
     <w:p>
       <w:pPr>
         <w:rPr>
-          <w:sz w:val="24"/>
-          <w:szCs w:val="24"/>
-          <w:lang w:val="uk-UA"/>
-        </w:rPr>
-      </w:pPr>
-      <w:r>
-        <w:rPr>
-          <w:sz w:val="24"/>
-          <w:szCs w:val="24"/>
+          <w:sz w:val="22"/>
+          <w:szCs w:val="22"/>
+          <w:lang w:val="uk-UA"/>
+        </w:rPr>
+      </w:pPr>
+      <w:r>
+        <w:rPr>
+          <w:sz w:val="22"/>
+          <w:szCs w:val="22"/>
           <w:lang w:val="uk-UA"/>
         </w:rPr>
         <w:t xml:space="preserve">Комісія у складі: </w:t>
@@ -102,23 +124,23 @@
       <w:pPr>
         <w:ind w:firstLine="720"/>
         <w:rPr>
-          <w:sz w:val="24"/>
-          <w:szCs w:val="24"/>
-          <w:lang w:val="uk-UA"/>
-        </w:rPr>
-      </w:pPr>
-      <w:r>
-        <w:rPr>
-          <w:sz w:val="24"/>
-          <w:szCs w:val="24"/>
+          <w:sz w:val="22"/>
+          <w:szCs w:val="22"/>
+          <w:lang w:val="uk-UA"/>
+        </w:rPr>
+      </w:pPr>
+      <w:r>
+        <w:rPr>
+          <w:sz w:val="22"/>
+          <w:szCs w:val="22"/>
           <w:lang w:val="uk-UA"/>
         </w:rPr>
         <w:t>Голова комісії:</w:t>
       </w:r>
       <w:r>
         <w:rPr>
-          <w:sz w:val="24"/>
-          <w:szCs w:val="24"/>
+          <w:sz w:val="22"/>
+          <w:szCs w:val="22"/>
           <w:lang w:val="uk-UA"/>
         </w:rPr>
         <w:t xml:space="preserve"> </w:t>
@@ -127,11 +149,33 @@
         <w:rPr>
           <w:b/>
           <w:bCs/>
-          <w:sz w:val="24"/>
-          <w:szCs w:val="24"/>
-          <w:lang w:val="uk-UA"/>
-        </w:rPr>
-        <w:t>{chairperson}</w:t>
+          <w:sz w:val="22"/>
+          <w:szCs w:val="22"/>
+          <w:lang w:val="uk-UA"/>
+        </w:rPr>
+        <w:t>{</w:t>
+      </w:r>
+      <w:proofErr w:type="spellStart"/>
+      <w:r>
+        <w:rPr>
+          <w:b/>
+          <w:bCs/>
+          <w:sz w:val="22"/>
+          <w:szCs w:val="22"/>
+          <w:lang w:val="uk-UA"/>
+        </w:rPr>
+        <w:t>chairperson</w:t>
+      </w:r>
+      <w:proofErr w:type="spellEnd"/>
+      <w:r>
+        <w:rPr>
+          <w:b/>
+          <w:bCs/>
+          <w:sz w:val="22"/>
+          <w:szCs w:val="22"/>
+          <w:lang w:val="uk-UA"/>
+        </w:rPr>
+        <w:t>}</w:t>
       </w:r>
     </w:p>
     <w:p>
@@ -140,23 +184,23 @@
         <w:rPr>
           <w:b/>
           <w:bCs/>
-          <w:sz w:val="24"/>
-          <w:szCs w:val="24"/>
-          <w:lang w:val="uk-UA"/>
-        </w:rPr>
-      </w:pPr>
-      <w:r>
-        <w:rPr>
-          <w:sz w:val="24"/>
-          <w:szCs w:val="24"/>
+          <w:sz w:val="22"/>
+          <w:szCs w:val="22"/>
+          <w:lang w:val="uk-UA"/>
+        </w:rPr>
+      </w:pPr>
+      <w:r>
+        <w:rPr>
+          <w:sz w:val="22"/>
+          <w:szCs w:val="22"/>
           <w:lang w:val="uk-UA"/>
         </w:rPr>
         <w:t>Члени комісії:</w:t>
       </w:r>
       <w:r>
         <w:rPr>
-          <w:sz w:val="24"/>
-          <w:szCs w:val="24"/>
+          <w:sz w:val="22"/>
+          <w:szCs w:val="22"/>
           <w:lang w:val="uk-UA"/>
         </w:rPr>
         <w:t xml:space="preserve"> </w:t>
@@ -165,18 +209,30 @@
         <w:rPr>
           <w:b/>
           <w:bCs/>
-          <w:sz w:val="24"/>
-          <w:szCs w:val="24"/>
-          <w:lang w:val="uk-UA"/>
-        </w:rPr>
-        <w:t>{member</w:t>
-      </w:r>
-      <w:r>
-        <w:rPr>
-          <w:b/>
-          <w:bCs/>
-          <w:sz w:val="24"/>
-          <w:szCs w:val="24"/>
+          <w:sz w:val="22"/>
+          <w:szCs w:val="22"/>
+          <w:lang w:val="uk-UA"/>
+        </w:rPr>
+        <w:t>{</w:t>
+      </w:r>
+      <w:proofErr w:type="spellStart"/>
+      <w:r>
+        <w:rPr>
+          <w:b/>
+          <w:bCs/>
+          <w:sz w:val="22"/>
+          <w:szCs w:val="22"/>
+          <w:lang w:val="uk-UA"/>
+        </w:rPr>
+        <w:t>member</w:t>
+      </w:r>
+      <w:proofErr w:type="spellEnd"/>
+      <w:r>
+        <w:rPr>
+          <w:b/>
+          <w:bCs/>
+          <w:sz w:val="22"/>
+          <w:szCs w:val="22"/>
           <w:lang w:val="en-US"/>
         </w:rPr>
         <w:t>s</w:t>
@@ -185,8 +241,8 @@
         <w:rPr>
           <w:b/>
           <w:bCs/>
-          <w:sz w:val="24"/>
-          <w:szCs w:val="24"/>
+          <w:sz w:val="22"/>
+          <w:szCs w:val="22"/>
           <w:lang w:val="uk-UA"/>
         </w:rPr>
         <w:t>}</w:t>
@@ -195,8 +251,8 @@
     <w:p>
       <w:pPr>
         <w:rPr>
-          <w:sz w:val="12"/>
-          <w:szCs w:val="12"/>
+          <w:sz w:val="10"/>
+          <w:szCs w:val="10"/>
           <w:lang w:val="uk-UA"/>
         </w:rPr>
       </w:pPr>
@@ -204,15 +260,15 @@
     <w:p>
       <w:pPr>
         <w:rPr>
-          <w:sz w:val="24"/>
-          <w:szCs w:val="24"/>
-          <w:lang w:val="uk-UA"/>
-        </w:rPr>
-      </w:pPr>
-      <w:r>
-        <w:rPr>
-          <w:sz w:val="24"/>
-          <w:szCs w:val="24"/>
+          <w:sz w:val="22"/>
+          <w:szCs w:val="22"/>
+          <w:lang w:val="uk-UA"/>
+        </w:rPr>
+      </w:pPr>
+      <w:r>
+        <w:rPr>
+          <w:sz w:val="22"/>
+          <w:szCs w:val="22"/>
           <w:lang w:val="uk-UA"/>
         </w:rPr>
         <w:t xml:space="preserve">Розглянула питання: Атестація зварників НПАОП 0.00-1.16-96, </w:t>
@@ -221,16 +277,38 @@
         <w:rPr>
           <w:b/>
           <w:bCs/>
-          <w:sz w:val="24"/>
-          <w:szCs w:val="24"/>
-          <w:lang w:val="uk-UA"/>
-        </w:rPr>
-        <w:t>{standards-list}</w:t>
-      </w:r>
-      <w:r>
-        <w:rPr>
-          <w:sz w:val="24"/>
-          <w:szCs w:val="24"/>
+          <w:sz w:val="22"/>
+          <w:szCs w:val="22"/>
+          <w:lang w:val="uk-UA"/>
+        </w:rPr>
+        <w:t>{</w:t>
+      </w:r>
+      <w:proofErr w:type="spellStart"/>
+      <w:r>
+        <w:rPr>
+          <w:b/>
+          <w:bCs/>
+          <w:sz w:val="22"/>
+          <w:szCs w:val="22"/>
+          <w:lang w:val="uk-UA"/>
+        </w:rPr>
+        <w:t>standards-list</w:t>
+      </w:r>
+      <w:proofErr w:type="spellEnd"/>
+      <w:r>
+        <w:rPr>
+          <w:b/>
+          <w:bCs/>
+          <w:sz w:val="22"/>
+          <w:szCs w:val="22"/>
+          <w:lang w:val="uk-UA"/>
+        </w:rPr>
+        <w:t>}</w:t>
+      </w:r>
+      <w:r>
+        <w:rPr>
+          <w:sz w:val="22"/>
+          <w:szCs w:val="22"/>
           <w:lang w:val="uk-UA"/>
         </w:rPr>
         <w:t>.</w:t>
@@ -243,55 +321,47 @@
           <w:tab w:val="left" w:pos="4536"/>
         </w:tabs>
         <w:rPr>
-          <w:sz w:val="24"/>
-          <w:szCs w:val="24"/>
-          <w:lang w:val="uk-UA"/>
-        </w:rPr>
-      </w:pPr>
-      <w:r>
-        <w:rPr>
-          <w:sz w:val="24"/>
-          <w:szCs w:val="24"/>
+          <w:sz w:val="22"/>
+          <w:szCs w:val="22"/>
+          <w:lang w:val="uk-UA"/>
+        </w:rPr>
+      </w:pPr>
+      <w:r>
+        <w:rPr>
+          <w:sz w:val="22"/>
+          <w:szCs w:val="22"/>
           <w:lang w:val="uk-UA"/>
         </w:rPr>
         <w:t>1.</w:t>
       </w:r>
       <w:r>
         <w:rPr>
-          <w:sz w:val="24"/>
-          <w:szCs w:val="24"/>
+          <w:sz w:val="22"/>
+          <w:szCs w:val="22"/>
           <w:lang w:val="uk-UA"/>
         </w:rPr>
         <w:tab/>
       </w:r>
       <w:r>
         <w:rPr>
-          <w:sz w:val="24"/>
-          <w:szCs w:val="24"/>
+          <w:sz w:val="22"/>
+          <w:szCs w:val="22"/>
           <w:lang w:val="uk-UA"/>
         </w:rPr>
         <w:t>Прізвище</w:t>
       </w:r>
       <w:r>
         <w:rPr>
-          <w:sz w:val="24"/>
-          <w:szCs w:val="24"/>
-          <w:lang w:val="uk-UA"/>
-        </w:rPr>
-        <w:t>,</w:t>
-      </w:r>
-      <w:r>
-        <w:rPr>
-          <w:sz w:val="24"/>
-          <w:szCs w:val="24"/>
-          <w:lang w:val="uk-UA"/>
-        </w:rPr>
-        <w:t xml:space="preserve"> ім’я, по батькові</w:t>
-      </w:r>
-      <w:r>
-        <w:rPr>
-          <w:sz w:val="24"/>
-          <w:szCs w:val="24"/>
+          <w:sz w:val="22"/>
+          <w:szCs w:val="22"/>
+          <w:lang w:val="uk-UA"/>
+        </w:rPr>
+        <w:t>, ім’я, по батькові</w:t>
+      </w:r>
+      <w:r>
+        <w:rPr>
+          <w:sz w:val="22"/>
+          <w:szCs w:val="22"/>
           <w:lang w:val="uk-UA"/>
         </w:rPr>
         <w:tab/>
@@ -300,8 +370,8 @@
         <w:rPr>
           <w:b/>
           <w:bCs/>
-          <w:sz w:val="24"/>
-          <w:szCs w:val="24"/>
+          <w:sz w:val="22"/>
+          <w:szCs w:val="22"/>
           <w:lang w:val="uk-UA"/>
         </w:rPr>
         <w:t>{</w:t>
@@ -310,8 +380,8 @@
         <w:rPr>
           <w:b/>
           <w:bCs/>
-          <w:sz w:val="24"/>
-          <w:szCs w:val="24"/>
+          <w:sz w:val="22"/>
+          <w:szCs w:val="22"/>
           <w:lang w:val="en-US"/>
         </w:rPr>
         <w:t>full</w:t>
@@ -320,11 +390,33 @@
         <w:rPr>
           <w:b/>
           <w:bCs/>
-          <w:sz w:val="24"/>
-          <w:szCs w:val="24"/>
-          <w:lang w:val="uk-UA"/>
-        </w:rPr>
-        <w:t>-name}</w:t>
+          <w:sz w:val="22"/>
+          <w:szCs w:val="22"/>
+          <w:lang w:val="uk-UA"/>
+        </w:rPr>
+        <w:t>-</w:t>
+      </w:r>
+      <w:proofErr w:type="spellStart"/>
+      <w:r>
+        <w:rPr>
+          <w:b/>
+          <w:bCs/>
+          <w:sz w:val="22"/>
+          <w:szCs w:val="22"/>
+          <w:lang w:val="uk-UA"/>
+        </w:rPr>
+        <w:t>name</w:t>
+      </w:r>
+      <w:proofErr w:type="spellEnd"/>
+      <w:r>
+        <w:rPr>
+          <w:b/>
+          <w:bCs/>
+          <w:sz w:val="22"/>
+          <w:szCs w:val="22"/>
+          <w:lang w:val="uk-UA"/>
+        </w:rPr>
+        <w:t>}</w:t>
       </w:r>
     </w:p>
     <w:p>
@@ -334,39 +426,39 @@
           <w:tab w:val="left" w:pos="4536"/>
         </w:tabs>
         <w:rPr>
-          <w:sz w:val="24"/>
-          <w:szCs w:val="24"/>
-          <w:lang w:val="uk-UA"/>
-        </w:rPr>
-      </w:pPr>
-      <w:r>
-        <w:rPr>
-          <w:sz w:val="24"/>
-          <w:szCs w:val="24"/>
+          <w:sz w:val="22"/>
+          <w:szCs w:val="22"/>
+          <w:lang w:val="uk-UA"/>
+        </w:rPr>
+      </w:pPr>
+      <w:r>
+        <w:rPr>
+          <w:sz w:val="22"/>
+          <w:szCs w:val="22"/>
           <w:lang w:val="uk-UA"/>
         </w:rPr>
         <w:t>2.</w:t>
       </w:r>
       <w:r>
         <w:rPr>
-          <w:sz w:val="24"/>
-          <w:szCs w:val="24"/>
+          <w:sz w:val="22"/>
+          <w:szCs w:val="22"/>
           <w:lang w:val="uk-UA"/>
         </w:rPr>
         <w:tab/>
       </w:r>
       <w:r>
         <w:rPr>
-          <w:sz w:val="24"/>
-          <w:szCs w:val="24"/>
+          <w:sz w:val="22"/>
+          <w:szCs w:val="22"/>
           <w:lang w:val="uk-UA"/>
         </w:rPr>
         <w:t>Рік/місце народження</w:t>
       </w:r>
       <w:r>
         <w:rPr>
-          <w:sz w:val="24"/>
-          <w:szCs w:val="24"/>
+          <w:sz w:val="22"/>
+          <w:szCs w:val="22"/>
           <w:lang w:val="uk-UA"/>
         </w:rPr>
         <w:tab/>
@@ -375,18 +467,40 @@
         <w:rPr>
           <w:b/>
           <w:bCs/>
-          <w:sz w:val="24"/>
-          <w:szCs w:val="24"/>
-          <w:lang w:val="uk-UA"/>
-        </w:rPr>
-        <w:t>{birth-year-</w:t>
-      </w:r>
-      <w:r>
-        <w:rPr>
-          <w:b/>
-          <w:bCs/>
-          <w:sz w:val="24"/>
-          <w:szCs w:val="24"/>
+          <w:sz w:val="22"/>
+          <w:szCs w:val="22"/>
+          <w:lang w:val="uk-UA"/>
+        </w:rPr>
+        <w:t>{</w:t>
+      </w:r>
+      <w:proofErr w:type="spellStart"/>
+      <w:r>
+        <w:rPr>
+          <w:b/>
+          <w:bCs/>
+          <w:sz w:val="22"/>
+          <w:szCs w:val="22"/>
+          <w:lang w:val="uk-UA"/>
+        </w:rPr>
+        <w:t>birth-year</w:t>
+      </w:r>
+      <w:proofErr w:type="spellEnd"/>
+      <w:r>
+        <w:rPr>
+          <w:b/>
+          <w:bCs/>
+          <w:sz w:val="22"/>
+          <w:szCs w:val="22"/>
+          <w:lang w:val="uk-UA"/>
+        </w:rPr>
+        <w:t>-</w:t>
+      </w:r>
+      <w:r>
+        <w:rPr>
+          <w:b/>
+          <w:bCs/>
+          <w:sz w:val="22"/>
+          <w:szCs w:val="22"/>
           <w:lang w:val="en-US"/>
         </w:rPr>
         <w:t>location</w:t>
@@ -395,8 +509,8 @@
         <w:rPr>
           <w:b/>
           <w:bCs/>
-          <w:sz w:val="24"/>
-          <w:szCs w:val="24"/>
+          <w:sz w:val="22"/>
+          <w:szCs w:val="22"/>
           <w:lang w:val="uk-UA"/>
         </w:rPr>
         <w:t>}</w:t>
@@ -409,39 +523,39 @@
           <w:tab w:val="left" w:pos="4536"/>
         </w:tabs>
         <w:rPr>
-          <w:sz w:val="24"/>
-          <w:szCs w:val="24"/>
-          <w:lang w:val="uk-UA"/>
-        </w:rPr>
-      </w:pPr>
-      <w:r>
-        <w:rPr>
-          <w:sz w:val="24"/>
-          <w:szCs w:val="24"/>
+          <w:sz w:val="22"/>
+          <w:szCs w:val="22"/>
+          <w:lang w:val="uk-UA"/>
+        </w:rPr>
+      </w:pPr>
+      <w:r>
+        <w:rPr>
+          <w:sz w:val="22"/>
+          <w:szCs w:val="22"/>
           <w:lang w:val="uk-UA"/>
         </w:rPr>
         <w:t>3.</w:t>
       </w:r>
       <w:r>
         <w:rPr>
-          <w:sz w:val="24"/>
-          <w:szCs w:val="24"/>
+          <w:sz w:val="22"/>
+          <w:szCs w:val="22"/>
           <w:lang w:val="uk-UA"/>
         </w:rPr>
         <w:tab/>
       </w:r>
       <w:r>
         <w:rPr>
-          <w:sz w:val="24"/>
-          <w:szCs w:val="24"/>
+          <w:sz w:val="22"/>
+          <w:szCs w:val="22"/>
           <w:lang w:val="uk-UA"/>
         </w:rPr>
         <w:t>Попередній кваліфікаційний документ</w:t>
       </w:r>
       <w:r>
         <w:rPr>
-          <w:sz w:val="24"/>
-          <w:szCs w:val="24"/>
+          <w:sz w:val="22"/>
+          <w:szCs w:val="22"/>
           <w:lang w:val="uk-UA"/>
         </w:rPr>
         <w:tab/>
@@ -450,11 +564,33 @@
         <w:rPr>
           <w:b/>
           <w:bCs/>
-          <w:sz w:val="24"/>
-          <w:szCs w:val="24"/>
-          <w:lang w:val="uk-UA"/>
-        </w:rPr>
-        <w:t>{qualification-doc-number}</w:t>
+          <w:sz w:val="22"/>
+          <w:szCs w:val="22"/>
+          <w:lang w:val="uk-UA"/>
+        </w:rPr>
+        <w:t>{</w:t>
+      </w:r>
+      <w:proofErr w:type="spellStart"/>
+      <w:r>
+        <w:rPr>
+          <w:b/>
+          <w:bCs/>
+          <w:sz w:val="22"/>
+          <w:szCs w:val="22"/>
+          <w:lang w:val="uk-UA"/>
+        </w:rPr>
+        <w:t>qualification-doc-number</w:t>
+      </w:r>
+      <w:proofErr w:type="spellEnd"/>
+      <w:r>
+        <w:rPr>
+          <w:b/>
+          <w:bCs/>
+          <w:sz w:val="22"/>
+          <w:szCs w:val="22"/>
+          <w:lang w:val="uk-UA"/>
+        </w:rPr>
+        <w:t>}</w:t>
       </w:r>
     </w:p>
     <w:p>
@@ -464,23 +600,23 @@
           <w:tab w:val="left" w:pos="4536"/>
         </w:tabs>
         <w:rPr>
-          <w:sz w:val="24"/>
-          <w:szCs w:val="24"/>
-          <w:lang w:val="uk-UA"/>
-        </w:rPr>
-      </w:pPr>
-      <w:r>
-        <w:rPr>
-          <w:sz w:val="24"/>
-          <w:szCs w:val="24"/>
+          <w:sz w:val="22"/>
+          <w:szCs w:val="22"/>
+          <w:lang w:val="uk-UA"/>
+        </w:rPr>
+      </w:pPr>
+      <w:r>
+        <w:rPr>
+          <w:sz w:val="22"/>
+          <w:szCs w:val="22"/>
           <w:lang w:val="uk-UA"/>
         </w:rPr>
         <w:t>4.</w:t>
       </w:r>
       <w:r>
         <w:rPr>
-          <w:sz w:val="24"/>
-          <w:szCs w:val="24"/>
+          <w:sz w:val="22"/>
+          <w:szCs w:val="22"/>
           <w:lang w:val="uk-UA"/>
         </w:rPr>
         <w:tab/>
@@ -488,8 +624,8 @@
       </w:r>
       <w:r>
         <w:rPr>
-          <w:sz w:val="24"/>
-          <w:szCs w:val="24"/>
+          <w:sz w:val="22"/>
+          <w:szCs w:val="22"/>
           <w:lang w:val="uk-UA"/>
         </w:rPr>
         <w:tab/>
@@ -498,11 +634,33 @@
         <w:rPr>
           <w:b/>
           <w:bCs/>
-          <w:sz w:val="24"/>
-          <w:szCs w:val="24"/>
-          <w:lang w:val="uk-UA"/>
-        </w:rPr>
-        <w:t>{work-experience-years}</w:t>
+          <w:sz w:val="22"/>
+          <w:szCs w:val="22"/>
+          <w:lang w:val="uk-UA"/>
+        </w:rPr>
+        <w:t>{</w:t>
+      </w:r>
+      <w:proofErr w:type="spellStart"/>
+      <w:r>
+        <w:rPr>
+          <w:b/>
+          <w:bCs/>
+          <w:sz w:val="22"/>
+          <w:szCs w:val="22"/>
+          <w:lang w:val="uk-UA"/>
+        </w:rPr>
+        <w:t>work-experience-years</w:t>
+      </w:r>
+      <w:proofErr w:type="spellEnd"/>
+      <w:r>
+        <w:rPr>
+          <w:b/>
+          <w:bCs/>
+          <w:sz w:val="22"/>
+          <w:szCs w:val="22"/>
+          <w:lang w:val="uk-UA"/>
+        </w:rPr>
+        <w:t>}</w:t>
       </w:r>
     </w:p>
     <w:p>
@@ -512,23 +670,23 @@
           <w:tab w:val="left" w:pos="4536"/>
         </w:tabs>
         <w:rPr>
-          <w:sz w:val="24"/>
-          <w:szCs w:val="24"/>
-          <w:lang w:val="uk-UA"/>
-        </w:rPr>
-      </w:pPr>
-      <w:r>
-        <w:rPr>
-          <w:sz w:val="24"/>
-          <w:szCs w:val="24"/>
+          <w:sz w:val="22"/>
+          <w:szCs w:val="22"/>
+          <w:lang w:val="uk-UA"/>
+        </w:rPr>
+      </w:pPr>
+      <w:r>
+        <w:rPr>
+          <w:sz w:val="22"/>
+          <w:szCs w:val="22"/>
           <w:lang w:val="uk-UA"/>
         </w:rPr>
         <w:t>5.</w:t>
       </w:r>
       <w:r>
         <w:rPr>
-          <w:sz w:val="24"/>
-          <w:szCs w:val="24"/>
+          <w:sz w:val="22"/>
+          <w:szCs w:val="22"/>
           <w:lang w:val="uk-UA"/>
         </w:rPr>
         <w:tab/>
@@ -536,8 +694,8 @@
       </w:r>
       <w:r>
         <w:rPr>
-          <w:sz w:val="24"/>
-          <w:szCs w:val="24"/>
+          <w:sz w:val="22"/>
+          <w:szCs w:val="22"/>
           <w:lang w:val="uk-UA"/>
         </w:rPr>
         <w:tab/>
@@ -546,11 +704,33 @@
         <w:rPr>
           <w:b/>
           <w:bCs/>
-          <w:sz w:val="24"/>
-          <w:szCs w:val="24"/>
-          <w:lang w:val="uk-UA"/>
-        </w:rPr>
-        <w:t>{type-of-certification}</w:t>
+          <w:sz w:val="22"/>
+          <w:szCs w:val="22"/>
+          <w:lang w:val="uk-UA"/>
+        </w:rPr>
+        <w:t>{</w:t>
+      </w:r>
+      <w:proofErr w:type="spellStart"/>
+      <w:r>
+        <w:rPr>
+          <w:b/>
+          <w:bCs/>
+          <w:sz w:val="22"/>
+          <w:szCs w:val="22"/>
+          <w:lang w:val="uk-UA"/>
+        </w:rPr>
+        <w:t>type-of-certification</w:t>
+      </w:r>
+      <w:proofErr w:type="spellEnd"/>
+      <w:r>
+        <w:rPr>
+          <w:b/>
+          <w:bCs/>
+          <w:sz w:val="22"/>
+          <w:szCs w:val="22"/>
+          <w:lang w:val="uk-UA"/>
+        </w:rPr>
+        <w:t>}</w:t>
       </w:r>
     </w:p>
     <w:p>
@@ -560,23 +740,23 @@
           <w:tab w:val="left" w:pos="4536"/>
         </w:tabs>
         <w:rPr>
-          <w:sz w:val="24"/>
-          <w:szCs w:val="24"/>
-          <w:lang w:val="uk-UA"/>
-        </w:rPr>
-      </w:pPr>
-      <w:r>
-        <w:rPr>
-          <w:sz w:val="24"/>
-          <w:szCs w:val="24"/>
+          <w:sz w:val="22"/>
+          <w:szCs w:val="22"/>
+          <w:lang w:val="uk-UA"/>
+        </w:rPr>
+      </w:pPr>
+      <w:r>
+        <w:rPr>
+          <w:sz w:val="22"/>
+          <w:szCs w:val="22"/>
           <w:lang w:val="uk-UA"/>
         </w:rPr>
         <w:t>6.</w:t>
       </w:r>
       <w:r>
         <w:rPr>
-          <w:sz w:val="24"/>
-          <w:szCs w:val="24"/>
+          <w:sz w:val="22"/>
+          <w:szCs w:val="22"/>
           <w:lang w:val="uk-UA"/>
         </w:rPr>
         <w:tab/>
@@ -590,23 +770,23 @@
           <w:tab w:val="left" w:pos="4536"/>
         </w:tabs>
         <w:rPr>
-          <w:sz w:val="24"/>
-          <w:szCs w:val="24"/>
-          <w:lang w:val="uk-UA"/>
-        </w:rPr>
-      </w:pPr>
-      <w:r>
-        <w:rPr>
-          <w:sz w:val="24"/>
-          <w:szCs w:val="24"/>
+          <w:sz w:val="22"/>
+          <w:szCs w:val="22"/>
+          <w:lang w:val="uk-UA"/>
+        </w:rPr>
+      </w:pPr>
+      <w:r>
+        <w:rPr>
+          <w:sz w:val="22"/>
+          <w:szCs w:val="22"/>
           <w:lang w:val="uk-UA"/>
         </w:rPr>
         <w:t>6.1.</w:t>
       </w:r>
       <w:r>
         <w:rPr>
-          <w:sz w:val="24"/>
-          <w:szCs w:val="24"/>
+          <w:sz w:val="22"/>
+          <w:szCs w:val="22"/>
           <w:lang w:val="uk-UA"/>
         </w:rPr>
         <w:tab/>
@@ -614,8 +794,8 @@
       </w:r>
       <w:r>
         <w:rPr>
-          <w:sz w:val="24"/>
-          <w:szCs w:val="24"/>
+          <w:sz w:val="22"/>
+          <w:szCs w:val="22"/>
           <w:lang w:val="uk-UA"/>
         </w:rPr>
         <w:tab/>
@@ -624,11 +804,33 @@
         <w:rPr>
           <w:b/>
           <w:bCs/>
-          <w:sz w:val="24"/>
-          <w:szCs w:val="24"/>
-          <w:lang w:val="uk-UA"/>
-        </w:rPr>
-        <w:t>{sample-mark}</w:t>
+          <w:sz w:val="22"/>
+          <w:szCs w:val="22"/>
+          <w:lang w:val="uk-UA"/>
+        </w:rPr>
+        <w:t>{</w:t>
+      </w:r>
+      <w:proofErr w:type="spellStart"/>
+      <w:r>
+        <w:rPr>
+          <w:b/>
+          <w:bCs/>
+          <w:sz w:val="22"/>
+          <w:szCs w:val="22"/>
+          <w:lang w:val="uk-UA"/>
+        </w:rPr>
+        <w:t>sample-mark</w:t>
+      </w:r>
+      <w:proofErr w:type="spellEnd"/>
+      <w:r>
+        <w:rPr>
+          <w:b/>
+          <w:bCs/>
+          <w:sz w:val="22"/>
+          <w:szCs w:val="22"/>
+          <w:lang w:val="uk-UA"/>
+        </w:rPr>
+        <w:t>}</w:t>
       </w:r>
     </w:p>
     <w:p>
@@ -638,23 +840,23 @@
           <w:tab w:val="left" w:pos="4536"/>
         </w:tabs>
         <w:rPr>
-          <w:sz w:val="24"/>
-          <w:szCs w:val="24"/>
-          <w:lang w:val="uk-UA"/>
-        </w:rPr>
-      </w:pPr>
-      <w:r>
-        <w:rPr>
-          <w:sz w:val="24"/>
-          <w:szCs w:val="24"/>
+          <w:sz w:val="22"/>
+          <w:szCs w:val="22"/>
+          <w:lang w:val="uk-UA"/>
+        </w:rPr>
+      </w:pPr>
+      <w:r>
+        <w:rPr>
+          <w:sz w:val="22"/>
+          <w:szCs w:val="22"/>
           <w:lang w:val="uk-UA"/>
         </w:rPr>
         <w:t>6.2.</w:t>
       </w:r>
       <w:r>
         <w:rPr>
-          <w:sz w:val="24"/>
-          <w:szCs w:val="24"/>
+          <w:sz w:val="22"/>
+          <w:szCs w:val="22"/>
           <w:lang w:val="uk-UA"/>
         </w:rPr>
         <w:tab/>
@@ -662,8 +864,8 @@
       </w:r>
       <w:r>
         <w:rPr>
-          <w:sz w:val="24"/>
-          <w:szCs w:val="24"/>
+          <w:sz w:val="22"/>
+          <w:szCs w:val="22"/>
           <w:lang w:val="uk-UA"/>
         </w:rPr>
         <w:tab/>
@@ -672,11 +874,33 @@
         <w:rPr>
           <w:b/>
           <w:bCs/>
-          <w:sz w:val="24"/>
-          <w:szCs w:val="24"/>
-          <w:lang w:val="uk-UA"/>
-        </w:rPr>
-        <w:t>{welding-method}</w:t>
+          <w:sz w:val="22"/>
+          <w:szCs w:val="22"/>
+          <w:lang w:val="uk-UA"/>
+        </w:rPr>
+        <w:t>{</w:t>
+      </w:r>
+      <w:proofErr w:type="spellStart"/>
+      <w:r>
+        <w:rPr>
+          <w:b/>
+          <w:bCs/>
+          <w:sz w:val="22"/>
+          <w:szCs w:val="22"/>
+          <w:lang w:val="uk-UA"/>
+        </w:rPr>
+        <w:t>welding-method</w:t>
+      </w:r>
+      <w:proofErr w:type="spellEnd"/>
+      <w:r>
+        <w:rPr>
+          <w:b/>
+          <w:bCs/>
+          <w:sz w:val="22"/>
+          <w:szCs w:val="22"/>
+          <w:lang w:val="uk-UA"/>
+        </w:rPr>
+        <w:t>}</w:t>
       </w:r>
     </w:p>
     <w:p>
@@ -686,23 +910,23 @@
           <w:tab w:val="left" w:pos="4536"/>
         </w:tabs>
         <w:rPr>
-          <w:sz w:val="24"/>
-          <w:szCs w:val="24"/>
-          <w:lang w:val="uk-UA"/>
-        </w:rPr>
-      </w:pPr>
-      <w:r>
-        <w:rPr>
-          <w:sz w:val="24"/>
-          <w:szCs w:val="24"/>
+          <w:sz w:val="22"/>
+          <w:szCs w:val="22"/>
+          <w:lang w:val="uk-UA"/>
+        </w:rPr>
+      </w:pPr>
+      <w:r>
+        <w:rPr>
+          <w:sz w:val="22"/>
+          <w:szCs w:val="22"/>
           <w:lang w:val="uk-UA"/>
         </w:rPr>
         <w:t>6.3.</w:t>
       </w:r>
       <w:r>
         <w:rPr>
-          <w:sz w:val="24"/>
-          <w:szCs w:val="24"/>
+          <w:sz w:val="22"/>
+          <w:szCs w:val="22"/>
           <w:lang w:val="uk-UA"/>
         </w:rPr>
         <w:tab/>
@@ -710,8 +934,8 @@
       </w:r>
       <w:r>
         <w:rPr>
-          <w:sz w:val="24"/>
-          <w:szCs w:val="24"/>
+          <w:sz w:val="22"/>
+          <w:szCs w:val="22"/>
           <w:lang w:val="uk-UA"/>
         </w:rPr>
         <w:tab/>
@@ -720,11 +944,33 @@
         <w:rPr>
           <w:b/>
           <w:bCs/>
-          <w:sz w:val="24"/>
-          <w:szCs w:val="24"/>
-          <w:lang w:val="uk-UA"/>
-        </w:rPr>
-        <w:t>{welded-parts-type}</w:t>
+          <w:sz w:val="22"/>
+          <w:szCs w:val="22"/>
+          <w:lang w:val="uk-UA"/>
+        </w:rPr>
+        <w:t>{</w:t>
+      </w:r>
+      <w:proofErr w:type="spellStart"/>
+      <w:r>
+        <w:rPr>
+          <w:b/>
+          <w:bCs/>
+          <w:sz w:val="22"/>
+          <w:szCs w:val="22"/>
+          <w:lang w:val="uk-UA"/>
+        </w:rPr>
+        <w:t>welded-parts-type</w:t>
+      </w:r>
+      <w:proofErr w:type="spellEnd"/>
+      <w:r>
+        <w:rPr>
+          <w:b/>
+          <w:bCs/>
+          <w:sz w:val="22"/>
+          <w:szCs w:val="22"/>
+          <w:lang w:val="uk-UA"/>
+        </w:rPr>
+        <w:t>}</w:t>
       </w:r>
     </w:p>
     <w:p>
@@ -734,23 +980,23 @@
           <w:tab w:val="left" w:pos="4536"/>
         </w:tabs>
         <w:rPr>
-          <w:sz w:val="24"/>
-          <w:szCs w:val="24"/>
-          <w:lang w:val="uk-UA"/>
-        </w:rPr>
-      </w:pPr>
-      <w:r>
-        <w:rPr>
-          <w:sz w:val="24"/>
-          <w:szCs w:val="24"/>
+          <w:sz w:val="22"/>
+          <w:szCs w:val="22"/>
+          <w:lang w:val="uk-UA"/>
+        </w:rPr>
+      </w:pPr>
+      <w:r>
+        <w:rPr>
+          <w:sz w:val="22"/>
+          <w:szCs w:val="22"/>
           <w:lang w:val="uk-UA"/>
         </w:rPr>
         <w:t>6.4.</w:t>
       </w:r>
       <w:r>
         <w:rPr>
-          <w:sz w:val="24"/>
-          <w:szCs w:val="24"/>
+          <w:sz w:val="22"/>
+          <w:szCs w:val="22"/>
           <w:lang w:val="uk-UA"/>
         </w:rPr>
         <w:tab/>
@@ -758,8 +1004,8 @@
       </w:r>
       <w:r>
         <w:rPr>
-          <w:sz w:val="24"/>
-          <w:szCs w:val="24"/>
+          <w:sz w:val="22"/>
+          <w:szCs w:val="22"/>
           <w:lang w:val="uk-UA"/>
         </w:rPr>
         <w:tab/>
@@ -768,11 +1014,33 @@
         <w:rPr>
           <w:b/>
           <w:bCs/>
-          <w:sz w:val="24"/>
-          <w:szCs w:val="24"/>
-          <w:lang w:val="uk-UA"/>
-        </w:rPr>
-        <w:t>{joint-type-description}</w:t>
+          <w:sz w:val="22"/>
+          <w:szCs w:val="22"/>
+          <w:lang w:val="uk-UA"/>
+        </w:rPr>
+        <w:t>{</w:t>
+      </w:r>
+      <w:proofErr w:type="spellStart"/>
+      <w:r>
+        <w:rPr>
+          <w:b/>
+          <w:bCs/>
+          <w:sz w:val="22"/>
+          <w:szCs w:val="22"/>
+          <w:lang w:val="uk-UA"/>
+        </w:rPr>
+        <w:t>joint-type-description</w:t>
+      </w:r>
+      <w:proofErr w:type="spellEnd"/>
+      <w:r>
+        <w:rPr>
+          <w:b/>
+          <w:bCs/>
+          <w:sz w:val="22"/>
+          <w:szCs w:val="22"/>
+          <w:lang w:val="uk-UA"/>
+        </w:rPr>
+        <w:t>}</w:t>
       </w:r>
     </w:p>
     <w:p>
@@ -782,23 +1050,23 @@
           <w:tab w:val="left" w:pos="4536"/>
         </w:tabs>
         <w:rPr>
-          <w:sz w:val="24"/>
-          <w:szCs w:val="24"/>
-          <w:lang w:val="uk-UA"/>
-        </w:rPr>
-      </w:pPr>
-      <w:r>
-        <w:rPr>
-          <w:sz w:val="24"/>
-          <w:szCs w:val="24"/>
+          <w:sz w:val="22"/>
+          <w:szCs w:val="22"/>
+          <w:lang w:val="uk-UA"/>
+        </w:rPr>
+      </w:pPr>
+      <w:r>
+        <w:rPr>
+          <w:sz w:val="22"/>
+          <w:szCs w:val="22"/>
           <w:lang w:val="uk-UA"/>
         </w:rPr>
         <w:t>6.5.</w:t>
       </w:r>
       <w:r>
         <w:rPr>
-          <w:sz w:val="24"/>
-          <w:szCs w:val="24"/>
+          <w:sz w:val="22"/>
+          <w:szCs w:val="22"/>
           <w:lang w:val="uk-UA"/>
         </w:rPr>
         <w:tab/>
@@ -806,8 +1074,8 @@
       </w:r>
       <w:r>
         <w:rPr>
-          <w:sz w:val="24"/>
-          <w:szCs w:val="24"/>
+          <w:sz w:val="22"/>
+          <w:szCs w:val="22"/>
           <w:lang w:val="uk-UA"/>
         </w:rPr>
         <w:tab/>
@@ -816,11 +1084,33 @@
         <w:rPr>
           <w:b/>
           <w:bCs/>
-          <w:sz w:val="24"/>
-          <w:szCs w:val="24"/>
-          <w:lang w:val="uk-UA"/>
-        </w:rPr>
-        <w:t>{welding-position}</w:t>
+          <w:sz w:val="22"/>
+          <w:szCs w:val="22"/>
+          <w:lang w:val="uk-UA"/>
+        </w:rPr>
+        <w:t>{</w:t>
+      </w:r>
+      <w:proofErr w:type="spellStart"/>
+      <w:r>
+        <w:rPr>
+          <w:b/>
+          <w:bCs/>
+          <w:sz w:val="22"/>
+          <w:szCs w:val="22"/>
+          <w:lang w:val="uk-UA"/>
+        </w:rPr>
+        <w:t>welding-position</w:t>
+      </w:r>
+      <w:proofErr w:type="spellEnd"/>
+      <w:r>
+        <w:rPr>
+          <w:b/>
+          <w:bCs/>
+          <w:sz w:val="22"/>
+          <w:szCs w:val="22"/>
+          <w:lang w:val="uk-UA"/>
+        </w:rPr>
+        <w:t>}</w:t>
       </w:r>
     </w:p>
     <w:p>
@@ -830,23 +1120,23 @@
           <w:tab w:val="left" w:pos="4536"/>
         </w:tabs>
         <w:rPr>
-          <w:sz w:val="24"/>
-          <w:szCs w:val="24"/>
-          <w:lang w:val="uk-UA"/>
-        </w:rPr>
-      </w:pPr>
-      <w:r>
-        <w:rPr>
-          <w:sz w:val="24"/>
-          <w:szCs w:val="24"/>
+          <w:sz w:val="22"/>
+          <w:szCs w:val="22"/>
+          <w:lang w:val="uk-UA"/>
+        </w:rPr>
+      </w:pPr>
+      <w:r>
+        <w:rPr>
+          <w:sz w:val="22"/>
+          <w:szCs w:val="22"/>
           <w:lang w:val="uk-UA"/>
         </w:rPr>
         <w:t>6.6.</w:t>
       </w:r>
       <w:r>
         <w:rPr>
-          <w:sz w:val="24"/>
-          <w:szCs w:val="24"/>
+          <w:sz w:val="22"/>
+          <w:szCs w:val="22"/>
           <w:lang w:val="uk-UA"/>
         </w:rPr>
         <w:tab/>
@@ -854,8 +1144,8 @@
       </w:r>
       <w:r>
         <w:rPr>
-          <w:sz w:val="24"/>
-          <w:szCs w:val="24"/>
+          <w:sz w:val="22"/>
+          <w:szCs w:val="22"/>
           <w:lang w:val="uk-UA"/>
         </w:rPr>
         <w:tab/>
@@ -864,11 +1154,33 @@
         <w:rPr>
           <w:b/>
           <w:bCs/>
-          <w:sz w:val="24"/>
-          <w:szCs w:val="24"/>
-          <w:lang w:val="uk-UA"/>
-        </w:rPr>
-        <w:t>{preheat-and-interpass}</w:t>
+          <w:sz w:val="22"/>
+          <w:szCs w:val="22"/>
+          <w:lang w:val="uk-UA"/>
+        </w:rPr>
+        <w:t>{</w:t>
+      </w:r>
+      <w:proofErr w:type="spellStart"/>
+      <w:r>
+        <w:rPr>
+          <w:b/>
+          <w:bCs/>
+          <w:sz w:val="22"/>
+          <w:szCs w:val="22"/>
+          <w:lang w:val="uk-UA"/>
+        </w:rPr>
+        <w:t>preheat-and-interpass</w:t>
+      </w:r>
+      <w:proofErr w:type="spellEnd"/>
+      <w:r>
+        <w:rPr>
+          <w:b/>
+          <w:bCs/>
+          <w:sz w:val="22"/>
+          <w:szCs w:val="22"/>
+          <w:lang w:val="uk-UA"/>
+        </w:rPr>
+        <w:t>}</w:t>
       </w:r>
     </w:p>
     <w:p>
@@ -878,23 +1190,23 @@
           <w:tab w:val="left" w:pos="4536"/>
         </w:tabs>
         <w:rPr>
-          <w:sz w:val="24"/>
-          <w:szCs w:val="24"/>
-          <w:lang w:val="uk-UA"/>
-        </w:rPr>
-      </w:pPr>
-      <w:r>
-        <w:rPr>
-          <w:sz w:val="24"/>
-          <w:szCs w:val="24"/>
+          <w:sz w:val="22"/>
+          <w:szCs w:val="22"/>
+          <w:lang w:val="uk-UA"/>
+        </w:rPr>
+      </w:pPr>
+      <w:r>
+        <w:rPr>
+          <w:sz w:val="22"/>
+          <w:szCs w:val="22"/>
           <w:lang w:val="uk-UA"/>
         </w:rPr>
         <w:t>6.7.</w:t>
       </w:r>
       <w:r>
         <w:rPr>
-          <w:sz w:val="24"/>
-          <w:szCs w:val="24"/>
+          <w:sz w:val="22"/>
+          <w:szCs w:val="22"/>
           <w:lang w:val="uk-UA"/>
         </w:rPr>
         <w:tab/>
@@ -902,8 +1214,8 @@
       </w:r>
       <w:r>
         <w:rPr>
-          <w:sz w:val="24"/>
-          <w:szCs w:val="24"/>
+          <w:sz w:val="22"/>
+          <w:szCs w:val="22"/>
           <w:lang w:val="uk-UA"/>
         </w:rPr>
         <w:tab/>
@@ -912,11 +1224,33 @@
         <w:rPr>
           <w:b/>
           <w:bCs/>
-          <w:sz w:val="24"/>
-          <w:szCs w:val="24"/>
-          <w:lang w:val="uk-UA"/>
-        </w:rPr>
-        <w:t>{heat-treatment}</w:t>
+          <w:sz w:val="22"/>
+          <w:szCs w:val="22"/>
+          <w:lang w:val="uk-UA"/>
+        </w:rPr>
+        <w:t>{</w:t>
+      </w:r>
+      <w:proofErr w:type="spellStart"/>
+      <w:r>
+        <w:rPr>
+          <w:b/>
+          <w:bCs/>
+          <w:sz w:val="22"/>
+          <w:szCs w:val="22"/>
+          <w:lang w:val="uk-UA"/>
+        </w:rPr>
+        <w:t>heat-treatment</w:t>
+      </w:r>
+      <w:proofErr w:type="spellEnd"/>
+      <w:r>
+        <w:rPr>
+          <w:b/>
+          <w:bCs/>
+          <w:sz w:val="22"/>
+          <w:szCs w:val="22"/>
+          <w:lang w:val="uk-UA"/>
+        </w:rPr>
+        <w:t>}</w:t>
       </w:r>
     </w:p>
     <w:p>
@@ -926,23 +1260,23 @@
           <w:tab w:val="left" w:pos="4536"/>
         </w:tabs>
         <w:rPr>
-          <w:sz w:val="24"/>
-          <w:szCs w:val="24"/>
-          <w:lang w:val="uk-UA"/>
-        </w:rPr>
-      </w:pPr>
-      <w:r>
-        <w:rPr>
-          <w:sz w:val="24"/>
-          <w:szCs w:val="24"/>
+          <w:sz w:val="22"/>
+          <w:szCs w:val="22"/>
+          <w:lang w:val="uk-UA"/>
+        </w:rPr>
+      </w:pPr>
+      <w:r>
+        <w:rPr>
+          <w:sz w:val="22"/>
+          <w:szCs w:val="22"/>
           <w:lang w:val="uk-UA"/>
         </w:rPr>
         <w:t>7.</w:t>
       </w:r>
       <w:r>
         <w:rPr>
-          <w:sz w:val="24"/>
-          <w:szCs w:val="24"/>
+          <w:sz w:val="22"/>
+          <w:szCs w:val="22"/>
           <w:lang w:val="uk-UA"/>
         </w:rPr>
         <w:tab/>
@@ -956,23 +1290,23 @@
           <w:tab w:val="left" w:pos="4536"/>
         </w:tabs>
         <w:rPr>
-          <w:sz w:val="24"/>
-          <w:szCs w:val="24"/>
-          <w:lang w:val="uk-UA"/>
-        </w:rPr>
-      </w:pPr>
-      <w:r>
-        <w:rPr>
-          <w:sz w:val="24"/>
-          <w:szCs w:val="24"/>
+          <w:sz w:val="22"/>
+          <w:szCs w:val="22"/>
+          <w:lang w:val="uk-UA"/>
+        </w:rPr>
+      </w:pPr>
+      <w:r>
+        <w:rPr>
+          <w:sz w:val="22"/>
+          <w:szCs w:val="22"/>
           <w:lang w:val="uk-UA"/>
         </w:rPr>
         <w:t>7.1.</w:t>
       </w:r>
       <w:r>
         <w:rPr>
-          <w:sz w:val="24"/>
-          <w:szCs w:val="24"/>
+          <w:sz w:val="22"/>
+          <w:szCs w:val="22"/>
           <w:lang w:val="uk-UA"/>
         </w:rPr>
         <w:tab/>
@@ -980,8 +1314,8 @@
       </w:r>
       <w:r>
         <w:rPr>
-          <w:sz w:val="24"/>
-          <w:szCs w:val="24"/>
+          <w:sz w:val="22"/>
+          <w:szCs w:val="22"/>
           <w:lang w:val="uk-UA"/>
         </w:rPr>
         <w:tab/>
@@ -990,11 +1324,33 @@
         <w:rPr>
           <w:b/>
           <w:bCs/>
-          <w:sz w:val="24"/>
-          <w:szCs w:val="24"/>
-          <w:lang w:val="uk-UA"/>
-        </w:rPr>
-        <w:t>{sample-material-grade}</w:t>
+          <w:sz w:val="22"/>
+          <w:szCs w:val="22"/>
+          <w:lang w:val="uk-UA"/>
+        </w:rPr>
+        <w:t>{</w:t>
+      </w:r>
+      <w:proofErr w:type="spellStart"/>
+      <w:r>
+        <w:rPr>
+          <w:b/>
+          <w:bCs/>
+          <w:sz w:val="22"/>
+          <w:szCs w:val="22"/>
+          <w:lang w:val="uk-UA"/>
+        </w:rPr>
+        <w:t>sample-material-grade</w:t>
+      </w:r>
+      <w:proofErr w:type="spellEnd"/>
+      <w:r>
+        <w:rPr>
+          <w:b/>
+          <w:bCs/>
+          <w:sz w:val="22"/>
+          <w:szCs w:val="22"/>
+          <w:lang w:val="uk-UA"/>
+        </w:rPr>
+        <w:t>}</w:t>
       </w:r>
     </w:p>
     <w:p>
@@ -1004,23 +1360,23 @@
           <w:tab w:val="left" w:pos="4536"/>
         </w:tabs>
         <w:rPr>
-          <w:sz w:val="24"/>
-          <w:szCs w:val="24"/>
-          <w:lang w:val="uk-UA"/>
-        </w:rPr>
-      </w:pPr>
-      <w:r>
-        <w:rPr>
-          <w:sz w:val="24"/>
-          <w:szCs w:val="24"/>
+          <w:sz w:val="22"/>
+          <w:szCs w:val="22"/>
+          <w:lang w:val="uk-UA"/>
+        </w:rPr>
+      </w:pPr>
+      <w:r>
+        <w:rPr>
+          <w:sz w:val="22"/>
+          <w:szCs w:val="22"/>
           <w:lang w:val="uk-UA"/>
         </w:rPr>
         <w:t>7.2.</w:t>
       </w:r>
       <w:r>
         <w:rPr>
-          <w:sz w:val="24"/>
-          <w:szCs w:val="24"/>
+          <w:sz w:val="22"/>
+          <w:szCs w:val="22"/>
           <w:lang w:val="uk-UA"/>
         </w:rPr>
         <w:tab/>
@@ -1028,8 +1384,8 @@
       </w:r>
       <w:r>
         <w:rPr>
-          <w:sz w:val="24"/>
-          <w:szCs w:val="24"/>
+          <w:sz w:val="22"/>
+          <w:szCs w:val="22"/>
           <w:lang w:val="uk-UA"/>
         </w:rPr>
         <w:tab/>
@@ -1038,11 +1394,33 @@
         <w:rPr>
           <w:b/>
           <w:bCs/>
-          <w:sz w:val="24"/>
-          <w:szCs w:val="24"/>
-          <w:lang w:val="uk-UA"/>
-        </w:rPr>
-        <w:t>{sample-thickness}</w:t>
+          <w:sz w:val="22"/>
+          <w:szCs w:val="22"/>
+          <w:lang w:val="uk-UA"/>
+        </w:rPr>
+        <w:t>{</w:t>
+      </w:r>
+      <w:proofErr w:type="spellStart"/>
+      <w:r>
+        <w:rPr>
+          <w:b/>
+          <w:bCs/>
+          <w:sz w:val="22"/>
+          <w:szCs w:val="22"/>
+          <w:lang w:val="uk-UA"/>
+        </w:rPr>
+        <w:t>sample-thickness</w:t>
+      </w:r>
+      <w:proofErr w:type="spellEnd"/>
+      <w:r>
+        <w:rPr>
+          <w:b/>
+          <w:bCs/>
+          <w:sz w:val="22"/>
+          <w:szCs w:val="22"/>
+          <w:lang w:val="uk-UA"/>
+        </w:rPr>
+        <w:t>}</w:t>
       </w:r>
     </w:p>
     <w:p>
@@ -1052,23 +1430,23 @@
           <w:tab w:val="left" w:pos="4536"/>
         </w:tabs>
         <w:rPr>
-          <w:sz w:val="24"/>
-          <w:szCs w:val="24"/>
-          <w:lang w:val="uk-UA"/>
-        </w:rPr>
-      </w:pPr>
-      <w:r>
-        <w:rPr>
-          <w:sz w:val="24"/>
-          <w:szCs w:val="24"/>
+          <w:sz w:val="22"/>
+          <w:szCs w:val="22"/>
+          <w:lang w:val="uk-UA"/>
+        </w:rPr>
+      </w:pPr>
+      <w:r>
+        <w:rPr>
+          <w:sz w:val="22"/>
+          <w:szCs w:val="22"/>
           <w:lang w:val="uk-UA"/>
         </w:rPr>
         <w:t>7.3.</w:t>
       </w:r>
       <w:r>
         <w:rPr>
-          <w:sz w:val="24"/>
-          <w:szCs w:val="24"/>
+          <w:sz w:val="22"/>
+          <w:szCs w:val="22"/>
           <w:lang w:val="uk-UA"/>
         </w:rPr>
         <w:tab/>
@@ -1076,8 +1454,8 @@
       </w:r>
       <w:r>
         <w:rPr>
-          <w:sz w:val="24"/>
-          <w:szCs w:val="24"/>
+          <w:sz w:val="22"/>
+          <w:szCs w:val="22"/>
           <w:lang w:val="uk-UA"/>
         </w:rPr>
         <w:tab/>
@@ -1086,11 +1464,33 @@
         <w:rPr>
           <w:b/>
           <w:bCs/>
-          <w:sz w:val="24"/>
-          <w:szCs w:val="24"/>
-          <w:lang w:val="uk-UA"/>
-        </w:rPr>
-        <w:t>{pipe-outer-diameter}</w:t>
+          <w:sz w:val="22"/>
+          <w:szCs w:val="22"/>
+          <w:lang w:val="uk-UA"/>
+        </w:rPr>
+        <w:t>{</w:t>
+      </w:r>
+      <w:proofErr w:type="spellStart"/>
+      <w:r>
+        <w:rPr>
+          <w:b/>
+          <w:bCs/>
+          <w:sz w:val="22"/>
+          <w:szCs w:val="22"/>
+          <w:lang w:val="uk-UA"/>
+        </w:rPr>
+        <w:t>pipe-outer-diameter</w:t>
+      </w:r>
+      <w:proofErr w:type="spellEnd"/>
+      <w:r>
+        <w:rPr>
+          <w:b/>
+          <w:bCs/>
+          <w:sz w:val="22"/>
+          <w:szCs w:val="22"/>
+          <w:lang w:val="uk-UA"/>
+        </w:rPr>
+        <w:t>}</w:t>
       </w:r>
     </w:p>
     <w:p>
@@ -1100,23 +1500,23 @@
           <w:tab w:val="left" w:pos="4536"/>
         </w:tabs>
         <w:rPr>
-          <w:sz w:val="24"/>
-          <w:szCs w:val="24"/>
-          <w:lang w:val="uk-UA"/>
-        </w:rPr>
-      </w:pPr>
-      <w:r>
-        <w:rPr>
-          <w:sz w:val="24"/>
-          <w:szCs w:val="24"/>
+          <w:sz w:val="22"/>
+          <w:szCs w:val="22"/>
+          <w:lang w:val="uk-UA"/>
+        </w:rPr>
+      </w:pPr>
+      <w:r>
+        <w:rPr>
+          <w:sz w:val="22"/>
+          <w:szCs w:val="22"/>
           <w:lang w:val="uk-UA"/>
         </w:rPr>
         <w:t>8.</w:t>
       </w:r>
       <w:r>
         <w:rPr>
-          <w:sz w:val="24"/>
-          <w:szCs w:val="24"/>
+          <w:sz w:val="22"/>
+          <w:szCs w:val="22"/>
           <w:lang w:val="uk-UA"/>
         </w:rPr>
         <w:tab/>
@@ -1130,23 +1530,23 @@
           <w:tab w:val="left" w:pos="4536"/>
         </w:tabs>
         <w:rPr>
-          <w:sz w:val="24"/>
-          <w:szCs w:val="24"/>
-          <w:lang w:val="uk-UA"/>
-        </w:rPr>
-      </w:pPr>
-      <w:r>
-        <w:rPr>
-          <w:sz w:val="24"/>
-          <w:szCs w:val="24"/>
+          <w:sz w:val="22"/>
+          <w:szCs w:val="22"/>
+          <w:lang w:val="uk-UA"/>
+        </w:rPr>
+      </w:pPr>
+      <w:r>
+        <w:rPr>
+          <w:sz w:val="22"/>
+          <w:szCs w:val="22"/>
           <w:lang w:val="uk-UA"/>
         </w:rPr>
         <w:t>8.1.</w:t>
       </w:r>
       <w:r>
         <w:rPr>
-          <w:sz w:val="24"/>
-          <w:szCs w:val="24"/>
+          <w:sz w:val="22"/>
+          <w:szCs w:val="22"/>
           <w:lang w:val="uk-UA"/>
         </w:rPr>
         <w:tab/>
@@ -1154,8 +1554,8 @@
       </w:r>
       <w:r>
         <w:rPr>
-          <w:sz w:val="24"/>
-          <w:szCs w:val="24"/>
+          <w:sz w:val="22"/>
+          <w:szCs w:val="22"/>
           <w:lang w:val="uk-UA"/>
         </w:rPr>
         <w:tab/>
@@ -1164,11 +1564,33 @@
         <w:rPr>
           <w:b/>
           <w:bCs/>
-          <w:sz w:val="24"/>
-          <w:szCs w:val="24"/>
-          <w:lang w:val="uk-UA"/>
-        </w:rPr>
-        <w:t>{electrode-or-wire}</w:t>
+          <w:sz w:val="22"/>
+          <w:szCs w:val="22"/>
+          <w:lang w:val="uk-UA"/>
+        </w:rPr>
+        <w:t>{</w:t>
+      </w:r>
+      <w:proofErr w:type="spellStart"/>
+      <w:r>
+        <w:rPr>
+          <w:b/>
+          <w:bCs/>
+          <w:sz w:val="22"/>
+          <w:szCs w:val="22"/>
+          <w:lang w:val="uk-UA"/>
+        </w:rPr>
+        <w:t>electrode-or-wire</w:t>
+      </w:r>
+      <w:proofErr w:type="spellEnd"/>
+      <w:r>
+        <w:rPr>
+          <w:b/>
+          <w:bCs/>
+          <w:sz w:val="22"/>
+          <w:szCs w:val="22"/>
+          <w:lang w:val="uk-UA"/>
+        </w:rPr>
+        <w:t>}</w:t>
       </w:r>
     </w:p>
     <w:p>
@@ -1178,23 +1600,23 @@
           <w:tab w:val="left" w:pos="4536"/>
         </w:tabs>
         <w:rPr>
-          <w:sz w:val="24"/>
-          <w:szCs w:val="24"/>
-          <w:lang w:val="uk-UA"/>
-        </w:rPr>
-      </w:pPr>
-      <w:r>
-        <w:rPr>
-          <w:sz w:val="24"/>
-          <w:szCs w:val="24"/>
+          <w:sz w:val="22"/>
+          <w:szCs w:val="22"/>
+          <w:lang w:val="uk-UA"/>
+        </w:rPr>
+      </w:pPr>
+      <w:r>
+        <w:rPr>
+          <w:sz w:val="22"/>
+          <w:szCs w:val="22"/>
           <w:lang w:val="uk-UA"/>
         </w:rPr>
         <w:t>8.2.</w:t>
       </w:r>
       <w:r>
         <w:rPr>
-          <w:sz w:val="24"/>
-          <w:szCs w:val="24"/>
+          <w:sz w:val="22"/>
+          <w:szCs w:val="22"/>
           <w:lang w:val="uk-UA"/>
         </w:rPr>
         <w:tab/>
@@ -1202,8 +1624,8 @@
       </w:r>
       <w:r>
         <w:rPr>
-          <w:sz w:val="24"/>
-          <w:szCs w:val="24"/>
+          <w:sz w:val="22"/>
+          <w:szCs w:val="22"/>
           <w:lang w:val="uk-UA"/>
         </w:rPr>
         <w:tab/>
@@ -1212,11 +1634,33 @@
         <w:rPr>
           <w:b/>
           <w:bCs/>
-          <w:sz w:val="24"/>
-          <w:szCs w:val="24"/>
-          <w:lang w:val="uk-UA"/>
-        </w:rPr>
-        <w:t>{shielding-gas-or-flux}</w:t>
+          <w:sz w:val="22"/>
+          <w:szCs w:val="22"/>
+          <w:lang w:val="uk-UA"/>
+        </w:rPr>
+        <w:t>{</w:t>
+      </w:r>
+      <w:proofErr w:type="spellStart"/>
+      <w:r>
+        <w:rPr>
+          <w:b/>
+          <w:bCs/>
+          <w:sz w:val="22"/>
+          <w:szCs w:val="22"/>
+          <w:lang w:val="uk-UA"/>
+        </w:rPr>
+        <w:t>shielding-gas-or-flux</w:t>
+      </w:r>
+      <w:proofErr w:type="spellEnd"/>
+      <w:r>
+        <w:rPr>
+          <w:b/>
+          <w:bCs/>
+          <w:sz w:val="22"/>
+          <w:szCs w:val="22"/>
+          <w:lang w:val="uk-UA"/>
+        </w:rPr>
+        <w:t>}</w:t>
       </w:r>
     </w:p>
     <w:p>
@@ -1226,23 +1670,23 @@
           <w:tab w:val="left" w:pos="4536"/>
         </w:tabs>
         <w:rPr>
-          <w:sz w:val="24"/>
-          <w:szCs w:val="24"/>
-          <w:lang w:val="uk-UA"/>
-        </w:rPr>
-      </w:pPr>
-      <w:r>
-        <w:rPr>
-          <w:sz w:val="24"/>
-          <w:szCs w:val="24"/>
+          <w:sz w:val="22"/>
+          <w:szCs w:val="22"/>
+          <w:lang w:val="uk-UA"/>
+        </w:rPr>
+      </w:pPr>
+      <w:r>
+        <w:rPr>
+          <w:sz w:val="22"/>
+          <w:szCs w:val="22"/>
           <w:lang w:val="uk-UA"/>
         </w:rPr>
         <w:t>9.</w:t>
       </w:r>
       <w:r>
         <w:rPr>
-          <w:sz w:val="24"/>
-          <w:szCs w:val="24"/>
+          <w:sz w:val="22"/>
+          <w:szCs w:val="22"/>
           <w:lang w:val="uk-UA"/>
         </w:rPr>
         <w:tab/>
@@ -1256,83 +1700,42 @@
           <w:tab w:val="left" w:pos="4536"/>
         </w:tabs>
         <w:rPr>
-          <w:sz w:val="24"/>
-          <w:szCs w:val="24"/>
-          <w:lang w:val="uk-UA"/>
-        </w:rPr>
-      </w:pPr>
-      <w:r>
-        <w:rPr>
-          <w:sz w:val="24"/>
-          <w:szCs w:val="24"/>
-          <w:lang w:val="uk-UA"/>
-        </w:rPr>
-        <w:t>{#items}</w:t>
-      </w:r>
-      <w:r>
-        <w:rPr>
-          <w:b/>
-          <w:bCs/>
-          <w:sz w:val="24"/>
-          <w:szCs w:val="24"/>
-          <w:lang w:val="uk-UA"/>
-        </w:rPr>
-        <w:t>{inspection</w:t>
-      </w:r>
-      <w:r>
-        <w:rPr>
-          <w:b/>
-          <w:bCs/>
-          <w:sz w:val="24"/>
-          <w:szCs w:val="24"/>
-          <w:lang w:val="en-US"/>
-        </w:rPr>
-        <w:t>-order-number</w:t>
-      </w:r>
-      <w:r>
-        <w:rPr>
-          <w:b/>
-          <w:bCs/>
-          <w:sz w:val="24"/>
-          <w:szCs w:val="24"/>
+          <w:sz w:val="22"/>
+          <w:szCs w:val="22"/>
+        </w:rPr>
+      </w:pPr>
+      <w:r>
+        <w:rPr>
+          <w:sz w:val="22"/>
+          <w:szCs w:val="22"/>
+          <w:lang w:val="uk-UA"/>
+        </w:rPr>
+        <w:t>{#</w:t>
+      </w:r>
+      <w:proofErr w:type="spellStart"/>
+      <w:r>
+        <w:rPr>
+          <w:sz w:val="22"/>
+          <w:szCs w:val="22"/>
+        </w:rPr>
+        <w:t>inspection</w:t>
+      </w:r>
+      <w:r>
+        <w:rPr>
+          <w:sz w:val="22"/>
+          <w:szCs w:val="22"/>
+          <w:lang w:val="uk-UA"/>
+        </w:rPr>
+        <w:t>items</w:t>
+      </w:r>
+      <w:proofErr w:type="spellEnd"/>
+      <w:r>
+        <w:rPr>
+          <w:sz w:val="22"/>
+          <w:szCs w:val="22"/>
           <w:lang w:val="uk-UA"/>
         </w:rPr>
         <w:t>}</w:t>
-      </w:r>
-      <w:r>
-        <w:rPr>
-          <w:sz w:val="24"/>
-          <w:szCs w:val="24"/>
-          <w:lang w:val="uk-UA"/>
-        </w:rPr>
-        <w:tab/>
-        <w:t>Візуальний огляд</w:t>
-      </w:r>
-      <w:r>
-        <w:rPr>
-          <w:sz w:val="24"/>
-          <w:szCs w:val="24"/>
-          <w:lang w:val="uk-UA"/>
-        </w:rPr>
-        <w:tab/>
-      </w:r>
-      <w:r>
-        <w:rPr>
-          <w:b/>
-          <w:bCs/>
-          <w:sz w:val="24"/>
-          <w:szCs w:val="24"/>
-          <w:lang w:val="uk-UA"/>
-        </w:rPr>
-        <w:t>{inspection}</w:t>
-      </w:r>
-      <w:r>
-        <w:rPr>
-          <w:sz w:val="24"/>
-          <w:szCs w:val="24"/>
-          <w:lang w:val="uk-UA"/>
-        </w:rPr>
-        <w:t>{/items}</w:t>
       </w:r>
     </w:p>
     <w:p>
@@ -1342,75 +1745,158 @@
           <w:tab w:val="left" w:pos="4536"/>
         </w:tabs>
         <w:rPr>
-          <w:sz w:val="24"/>
-          <w:szCs w:val="24"/>
-          <w:lang w:val="uk-UA"/>
-        </w:rPr>
-      </w:pPr>
-      <w:r>
-        <w:rPr>
-          <w:sz w:val="24"/>
-          <w:szCs w:val="24"/>
-          <w:lang w:val="uk-UA"/>
-        </w:rPr>
-        <w:t>10.</w:t>
-      </w:r>
-      <w:r>
-        <w:rPr>
-          <w:sz w:val="24"/>
-          <w:szCs w:val="24"/>
+          <w:b/>
+          <w:bCs/>
+          <w:sz w:val="22"/>
+          <w:szCs w:val="22"/>
+          <w:lang w:val="en-US"/>
+        </w:rPr>
+      </w:pPr>
+      <w:r>
+        <w:rPr>
+          <w:sz w:val="22"/>
+          <w:szCs w:val="22"/>
+          <w:lang w:val="uk-UA"/>
+        </w:rPr>
+        <w:t>{</w:t>
+      </w:r>
+      <w:proofErr w:type="spellStart"/>
+      <w:r>
+        <w:rPr>
+          <w:sz w:val="22"/>
+          <w:szCs w:val="22"/>
+          <w:lang w:val="uk-UA"/>
+        </w:rPr>
+        <w:t>inspection</w:t>
+      </w:r>
+      <w:proofErr w:type="spellEnd"/>
+      <w:r>
+        <w:rPr>
+          <w:sz w:val="22"/>
+          <w:szCs w:val="22"/>
+          <w:lang w:val="uk-UA"/>
+        </w:rPr>
+        <w:t>-</w:t>
+      </w:r>
+      <w:r>
+        <w:rPr>
+          <w:sz w:val="22"/>
+          <w:szCs w:val="22"/>
+          <w:lang w:val="en-US"/>
+        </w:rPr>
+        <w:t>order</w:t>
+      </w:r>
+      <w:r>
+        <w:rPr>
+          <w:sz w:val="22"/>
+          <w:szCs w:val="22"/>
+          <w:lang w:val="uk-UA"/>
+        </w:rPr>
+        <w:t>-</w:t>
+      </w:r>
+      <w:r>
+        <w:rPr>
+          <w:sz w:val="22"/>
+          <w:szCs w:val="22"/>
+          <w:lang w:val="en-US"/>
+        </w:rPr>
+        <w:t>number</w:t>
+      </w:r>
+      <w:r>
+        <w:rPr>
+          <w:sz w:val="22"/>
+          <w:szCs w:val="22"/>
+          <w:lang w:val="uk-UA"/>
+        </w:rPr>
+        <w:t>}</w:t>
+      </w:r>
+      <w:r>
+        <w:rPr>
+          <w:sz w:val="22"/>
+          <w:szCs w:val="22"/>
           <w:lang w:val="uk-UA"/>
         </w:rPr>
         <w:tab/>
-        <w:t xml:space="preserve">Назва НД що до норм оцінки якості: </w:t>
-      </w:r>
-      <w:r>
-        <w:rPr>
-          <w:b/>
-          <w:bCs/>
-          <w:sz w:val="24"/>
-          <w:szCs w:val="24"/>
-          <w:lang w:val="uk-UA"/>
-        </w:rPr>
-        <w:t>{standards-list</w:t>
-      </w:r>
-      <w:r>
-        <w:rPr>
-          <w:b/>
-          <w:bCs/>
-          <w:sz w:val="24"/>
-          <w:szCs w:val="24"/>
+      </w:r>
+      <w:r>
+        <w:rPr>
+          <w:sz w:val="22"/>
+          <w:szCs w:val="22"/>
+          <w:lang w:val="uk-UA"/>
+        </w:rPr>
+        <w:t>{</w:t>
+      </w:r>
+      <w:r>
+        <w:rPr>
+          <w:sz w:val="22"/>
+          <w:szCs w:val="22"/>
+          <w:lang w:val="en-US"/>
+        </w:rPr>
+        <w:t>test</w:t>
+      </w:r>
+      <w:r>
+        <w:rPr>
+          <w:sz w:val="22"/>
+          <w:szCs w:val="22"/>
           <w:lang w:val="uk-UA"/>
         </w:rPr>
         <w:t>-</w:t>
       </w:r>
       <w:r>
         <w:rPr>
-          <w:b/>
-          <w:bCs/>
-          <w:sz w:val="24"/>
-          <w:szCs w:val="24"/>
-          <w:lang w:val="uk-UA"/>
-        </w:rPr>
-        <w:t>admission</w:t>
-      </w:r>
-      <w:r>
-        <w:rPr>
-          <w:b/>
-          <w:bCs/>
-          <w:sz w:val="24"/>
-          <w:szCs w:val="24"/>
+          <w:sz w:val="22"/>
+          <w:szCs w:val="22"/>
+          <w:lang w:val="en-US"/>
+        </w:rPr>
+        <w:t>type</w:t>
+      </w:r>
+      <w:r>
+        <w:rPr>
+          <w:sz w:val="22"/>
+          <w:szCs w:val="22"/>
           <w:lang w:val="uk-UA"/>
         </w:rPr>
         <w:t>}</w:t>
       </w:r>
       <w:r>
         <w:rPr>
-          <w:sz w:val="24"/>
-          <w:szCs w:val="24"/>
-          <w:lang w:val="uk-UA"/>
-        </w:rPr>
-        <w:t>.</w:t>
+          <w:sz w:val="22"/>
+          <w:szCs w:val="22"/>
+          <w:lang w:val="uk-UA"/>
+        </w:rPr>
+        <w:tab/>
+      </w:r>
+      <w:r>
+        <w:rPr>
+          <w:b/>
+          <w:bCs/>
+          <w:sz w:val="22"/>
+          <w:szCs w:val="22"/>
+          <w:lang w:val="uk-UA"/>
+        </w:rPr>
+        <w:t>{</w:t>
+      </w:r>
+      <w:proofErr w:type="spellStart"/>
+      <w:r>
+        <w:rPr>
+          <w:b/>
+          <w:bCs/>
+          <w:sz w:val="22"/>
+          <w:szCs w:val="22"/>
+          <w:lang w:val="uk-UA"/>
+        </w:rPr>
+        <w:t>inspection</w:t>
+      </w:r>
+      <w:proofErr w:type="spellEnd"/>
+      <w:r>
+        <w:rPr>
+          <w:b/>
+          <w:bCs/>
+          <w:sz w:val="22"/>
+          <w:szCs w:val="22"/>
+          <w:lang w:val="uk-UA"/>
+        </w:rPr>
+        <w:t>}</w:t>
       </w:r>
     </w:p>
     <w:p>
@@ -1420,45 +1906,52 @@
           <w:tab w:val="left" w:pos="4536"/>
         </w:tabs>
         <w:rPr>
-          <w:sz w:val="24"/>
-          <w:szCs w:val="24"/>
-          <w:lang w:val="uk-UA"/>
-        </w:rPr>
-      </w:pPr>
-      <w:r>
-        <w:rPr>
-          <w:sz w:val="24"/>
-          <w:szCs w:val="24"/>
-          <w:lang w:val="uk-UA"/>
-        </w:rPr>
-        <w:t>11.</w:t>
-      </w:r>
-      <w:r>
-        <w:rPr>
-          <w:sz w:val="24"/>
-          <w:szCs w:val="24"/>
-          <w:lang w:val="uk-UA"/>
-        </w:rPr>
-        <w:tab/>
-        <w:t>Оцінка теоретичних знань</w:t>
-      </w:r>
-      <w:r>
-        <w:rPr>
-          <w:sz w:val="24"/>
-          <w:szCs w:val="24"/>
-          <w:lang w:val="uk-UA"/>
-        </w:rPr>
-        <w:tab/>
-      </w:r>
-      <w:r>
-        <w:rPr>
-          <w:b/>
-          <w:bCs/>
-          <w:sz w:val="24"/>
-          <w:szCs w:val="24"/>
-          <w:lang w:val="uk-UA"/>
-        </w:rPr>
-        <w:t>{theory-score}</w:t>
+          <w:sz w:val="22"/>
+          <w:szCs w:val="22"/>
+          <w:lang w:val="uk-UA"/>
+        </w:rPr>
+      </w:pPr>
+      <w:r>
+        <w:rPr>
+          <w:sz w:val="22"/>
+          <w:szCs w:val="22"/>
+          <w:lang w:val="uk-UA"/>
+        </w:rPr>
+        <w:t>{</w:t>
+      </w:r>
+      <w:r>
+        <w:rPr>
+          <w:sz w:val="22"/>
+          <w:szCs w:val="22"/>
+          <w:lang w:val="en-US"/>
+        </w:rPr>
+        <w:t>/</w:t>
+      </w:r>
+      <w:r>
+        <w:rPr>
+          <w:sz w:val="22"/>
+          <w:szCs w:val="22"/>
+          <w:lang w:val="en-US"/>
+        </w:rPr>
+        <w:t>inspection</w:t>
+      </w:r>
+      <w:proofErr w:type="spellStart"/>
+      <w:r>
+        <w:rPr>
+          <w:sz w:val="22"/>
+          <w:szCs w:val="22"/>
+          <w:lang w:val="uk-UA"/>
+        </w:rPr>
+        <w:t>items</w:t>
+      </w:r>
+      <w:proofErr w:type="spellEnd"/>
+      <w:r>
+        <w:rPr>
+          <w:sz w:val="22"/>
+          <w:szCs w:val="22"/>
+          <w:lang w:val="uk-UA"/>
+        </w:rPr>
+        <w:t>}</w:t>
       </w:r>
     </w:p>
     <w:p>
@@ -1468,109 +1961,77 @@
           <w:tab w:val="left" w:pos="4536"/>
         </w:tabs>
         <w:rPr>
-          <w:sz w:val="24"/>
-          <w:szCs w:val="24"/>
-          <w:lang w:val="uk-UA"/>
-        </w:rPr>
-      </w:pPr>
-      <w:r>
-        <w:rPr>
-          <w:sz w:val="24"/>
-          <w:szCs w:val="24"/>
-          <w:lang w:val="uk-UA"/>
-        </w:rPr>
-        <w:t>12.</w:t>
-      </w:r>
-      <w:r>
-        <w:rPr>
-          <w:sz w:val="24"/>
-          <w:szCs w:val="24"/>
+          <w:sz w:val="22"/>
+          <w:szCs w:val="22"/>
+          <w:lang w:val="uk-UA"/>
+        </w:rPr>
+      </w:pPr>
+      <w:r>
+        <w:rPr>
+          <w:sz w:val="22"/>
+          <w:szCs w:val="22"/>
+          <w:lang w:val="uk-UA"/>
+        </w:rPr>
+        <w:t>10.</w:t>
+      </w:r>
+      <w:r>
+        <w:rPr>
+          <w:sz w:val="22"/>
+          <w:szCs w:val="22"/>
           <w:lang w:val="uk-UA"/>
         </w:rPr>
         <w:tab/>
-        <w:t>Рішення атестаційної комісії:</w:t>
-      </w:r>
-    </w:p>
-    <w:p>
-      <w:pPr>
-        <w:ind w:firstLine="426"/>
-        <w:rPr>
-          <w:sz w:val="24"/>
-          <w:szCs w:val="24"/>
-          <w:lang w:val="en-US"/>
-        </w:rPr>
-      </w:pPr>
-      <w:r>
-        <w:rPr>
-          <w:sz w:val="24"/>
-          <w:szCs w:val="24"/>
-          <w:lang w:val="uk-UA"/>
-        </w:rPr>
-        <w:t xml:space="preserve">Допущений до </w:t>
-      </w:r>
-      <w:r>
-        <w:rPr>
-          <w:b/>
-          <w:bCs/>
-          <w:sz w:val="24"/>
-          <w:szCs w:val="24"/>
-          <w:lang w:val="uk-UA"/>
-        </w:rPr>
-        <w:t>{admission-type}</w:t>
-      </w:r>
-      <w:r>
-        <w:rPr>
-          <w:b/>
-          <w:bCs/>
-          <w:sz w:val="24"/>
-          <w:szCs w:val="24"/>
-          <w:lang w:val="en-US"/>
+        <w:t xml:space="preserve">Назва НД що до норм оцінки якості: </w:t>
+      </w:r>
+      <w:r>
+        <w:rPr>
+          <w:b/>
+          <w:bCs/>
+          <w:sz w:val="22"/>
+          <w:szCs w:val="22"/>
+          <w:lang w:val="uk-UA"/>
+        </w:rPr>
+        <w:t>{</w:t>
+      </w:r>
+      <w:proofErr w:type="spellStart"/>
+      <w:r>
+        <w:rPr>
+          <w:b/>
+          <w:bCs/>
+          <w:sz w:val="22"/>
+          <w:szCs w:val="22"/>
+          <w:lang w:val="uk-UA"/>
+        </w:rPr>
+        <w:t>standards-list</w:t>
+      </w:r>
+      <w:r>
+        <w:rPr>
+          <w:b/>
+          <w:bCs/>
+          <w:sz w:val="22"/>
+          <w:szCs w:val="22"/>
+          <w:lang w:val="uk-UA"/>
+        </w:rPr>
+        <w:t>-admission</w:t>
+      </w:r>
+      <w:proofErr w:type="spellEnd"/>
+      <w:r>
+        <w:rPr>
+          <w:b/>
+          <w:bCs/>
+          <w:sz w:val="22"/>
+          <w:szCs w:val="22"/>
+          <w:lang w:val="uk-UA"/>
+        </w:rPr>
+        <w:t>}</w:t>
+      </w:r>
+      <w:r>
+        <w:rPr>
+          <w:sz w:val="22"/>
+          <w:szCs w:val="22"/>
+          <w:lang w:val="uk-UA"/>
         </w:rPr>
         <w:t>.</w:t>
-      </w:r>
-    </w:p>
-    <w:p>
-      <w:pPr>
-        <w:ind w:firstLine="426"/>
-        <w:rPr>
-          <w:b/>
-          <w:bCs/>
-          <w:sz w:val="24"/>
-          <w:szCs w:val="24"/>
-          <w:lang w:val="uk-UA"/>
-        </w:rPr>
-      </w:pPr>
-      <w:r>
-        <w:rPr>
-          <w:b/>
-          <w:bCs/>
-          <w:sz w:val="24"/>
-          <w:szCs w:val="24"/>
-          <w:lang w:val="uk-UA"/>
-        </w:rPr>
-        <w:t>{certification}</w:t>
-      </w:r>
-    </w:p>
-    <w:p>
-      <w:pPr>
-        <w:ind w:firstLine="426"/>
-        <w:rPr>
-          <w:b/>
-          <w:bCs/>
-          <w:sz w:val="24"/>
-          <w:szCs w:val="24"/>
-          <w:lang w:val="uk-UA"/>
-        </w:rPr>
-      </w:pPr>
-      <w:r>
-        <w:rPr>
-          <w:b/>
-          <w:bCs/>
-          <w:sz w:val="24"/>
-          <w:szCs w:val="24"/>
-          <w:lang w:val="uk-UA"/>
-        </w:rPr>
-        <w:t>{admission}</w:t>
       </w:r>
     </w:p>
     <w:p>
@@ -1580,23 +2041,271 @@
           <w:tab w:val="left" w:pos="4536"/>
         </w:tabs>
         <w:rPr>
-          <w:sz w:val="24"/>
-          <w:szCs w:val="24"/>
-          <w:lang w:val="uk-UA"/>
-        </w:rPr>
-      </w:pPr>
-      <w:r>
-        <w:rPr>
-          <w:sz w:val="24"/>
-          <w:szCs w:val="24"/>
+          <w:sz w:val="22"/>
+          <w:szCs w:val="22"/>
+          <w:lang w:val="uk-UA"/>
+        </w:rPr>
+      </w:pPr>
+      <w:r>
+        <w:rPr>
+          <w:sz w:val="22"/>
+          <w:szCs w:val="22"/>
+          <w:lang w:val="uk-UA"/>
+        </w:rPr>
+        <w:t>11.</w:t>
+      </w:r>
+      <w:r>
+        <w:rPr>
+          <w:sz w:val="22"/>
+          <w:szCs w:val="22"/>
+          <w:lang w:val="uk-UA"/>
+        </w:rPr>
+        <w:tab/>
+        <w:t>Оцінка теоретичних знань</w:t>
+      </w:r>
+      <w:r>
+        <w:rPr>
+          <w:sz w:val="22"/>
+          <w:szCs w:val="22"/>
+          <w:lang w:val="uk-UA"/>
+        </w:rPr>
+        <w:tab/>
+      </w:r>
+      <w:r>
+        <w:rPr>
+          <w:b/>
+          <w:bCs/>
+          <w:sz w:val="22"/>
+          <w:szCs w:val="22"/>
+          <w:lang w:val="uk-UA"/>
+        </w:rPr>
+        <w:t>{</w:t>
+      </w:r>
+      <w:proofErr w:type="spellStart"/>
+      <w:r>
+        <w:rPr>
+          <w:b/>
+          <w:bCs/>
+          <w:sz w:val="22"/>
+          <w:szCs w:val="22"/>
+          <w:lang w:val="uk-UA"/>
+        </w:rPr>
+        <w:t>theory-score</w:t>
+      </w:r>
+      <w:proofErr w:type="spellEnd"/>
+      <w:r>
+        <w:rPr>
+          <w:b/>
+          <w:bCs/>
+          <w:sz w:val="22"/>
+          <w:szCs w:val="22"/>
+          <w:lang w:val="uk-UA"/>
+        </w:rPr>
+        <w:t>}</w:t>
+      </w:r>
+    </w:p>
+    <w:p>
+      <w:pPr>
+        <w:tabs>
+          <w:tab w:val="left" w:pos="426"/>
+          <w:tab w:val="left" w:pos="4536"/>
+        </w:tabs>
+        <w:rPr>
+          <w:sz w:val="22"/>
+          <w:szCs w:val="22"/>
+          <w:lang w:val="uk-UA"/>
+        </w:rPr>
+      </w:pPr>
+      <w:r>
+        <w:rPr>
+          <w:sz w:val="22"/>
+          <w:szCs w:val="22"/>
+          <w:lang w:val="uk-UA"/>
+        </w:rPr>
+        <w:t>12.</w:t>
+      </w:r>
+      <w:r>
+        <w:rPr>
+          <w:sz w:val="22"/>
+          <w:szCs w:val="22"/>
+          <w:lang w:val="uk-UA"/>
+        </w:rPr>
+        <w:tab/>
+        <w:t>Рішення атестаційної комісії:</w:t>
+      </w:r>
+    </w:p>
+    <w:p>
+      <w:pPr>
+        <w:ind w:firstLine="426"/>
+        <w:rPr>
+          <w:sz w:val="22"/>
+          <w:szCs w:val="22"/>
+          <w:lang w:val="uk-UA"/>
+        </w:rPr>
+      </w:pPr>
+      <w:r>
+        <w:rPr>
+          <w:sz w:val="22"/>
+          <w:szCs w:val="22"/>
+          <w:lang w:val="uk-UA"/>
+        </w:rPr>
+        <w:t xml:space="preserve">Допущений до </w:t>
+      </w:r>
+      <w:r>
+        <w:rPr>
+          <w:b/>
+          <w:bCs/>
+          <w:sz w:val="22"/>
+          <w:szCs w:val="22"/>
+          <w:lang w:val="uk-UA"/>
+        </w:rPr>
+        <w:t>{</w:t>
+      </w:r>
+      <w:proofErr w:type="spellStart"/>
+      <w:r>
+        <w:rPr>
+          <w:b/>
+          <w:bCs/>
+          <w:sz w:val="22"/>
+          <w:szCs w:val="22"/>
+          <w:lang w:val="uk-UA"/>
+        </w:rPr>
+        <w:t>admission-type</w:t>
+      </w:r>
+      <w:proofErr w:type="spellEnd"/>
+      <w:r>
+        <w:rPr>
+          <w:b/>
+          <w:bCs/>
+          <w:sz w:val="22"/>
+          <w:szCs w:val="22"/>
+          <w:lang w:val="uk-UA"/>
+        </w:rPr>
+        <w:t>}</w:t>
+      </w:r>
+      <w:r>
+        <w:rPr>
+          <w:b/>
+          <w:bCs/>
+          <w:sz w:val="22"/>
+          <w:szCs w:val="22"/>
+          <w:lang w:val="uk-UA"/>
+        </w:rPr>
+        <w:t>.</w:t>
+      </w:r>
+    </w:p>
+    <w:p>
+      <w:pPr>
+        <w:ind w:firstLine="426"/>
+        <w:rPr>
+          <w:b/>
+          <w:bCs/>
+          <w:sz w:val="22"/>
+          <w:szCs w:val="22"/>
+          <w:lang w:val="uk-UA"/>
+        </w:rPr>
+      </w:pPr>
+      <w:r>
+        <w:rPr>
+          <w:b/>
+          <w:bCs/>
+          <w:sz w:val="22"/>
+          <w:szCs w:val="22"/>
+          <w:lang w:val="uk-UA"/>
+        </w:rPr>
+        <w:t>{</w:t>
+      </w:r>
+      <w:proofErr w:type="spellStart"/>
+      <w:r>
+        <w:rPr>
+          <w:b/>
+          <w:bCs/>
+          <w:sz w:val="22"/>
+          <w:szCs w:val="22"/>
+          <w:lang w:val="uk-UA"/>
+        </w:rPr>
+        <w:t>certification</w:t>
+      </w:r>
+      <w:proofErr w:type="spellEnd"/>
+      <w:r>
+        <w:rPr>
+          <w:b/>
+          <w:bCs/>
+          <w:sz w:val="22"/>
+          <w:szCs w:val="22"/>
+          <w:lang w:val="uk-UA"/>
+        </w:rPr>
+        <w:t>}</w:t>
+      </w:r>
+    </w:p>
+    <w:p>
+      <w:pPr>
+        <w:ind w:firstLine="426"/>
+        <w:rPr>
+          <w:b/>
+          <w:bCs/>
+          <w:sz w:val="22"/>
+          <w:szCs w:val="22"/>
+          <w:lang w:val="uk-UA"/>
+        </w:rPr>
+      </w:pPr>
+      <w:r>
+        <w:rPr>
+          <w:b/>
+          <w:bCs/>
+          <w:sz w:val="22"/>
+          <w:szCs w:val="22"/>
+          <w:lang w:val="uk-UA"/>
+        </w:rPr>
+        <w:t>{</w:t>
+      </w:r>
+      <w:proofErr w:type="spellStart"/>
+      <w:r>
+        <w:rPr>
+          <w:b/>
+          <w:bCs/>
+          <w:sz w:val="22"/>
+          <w:szCs w:val="22"/>
+          <w:lang w:val="uk-UA"/>
+        </w:rPr>
+        <w:t>admission</w:t>
+      </w:r>
+      <w:proofErr w:type="spellEnd"/>
+      <w:r>
+        <w:rPr>
+          <w:b/>
+          <w:bCs/>
+          <w:sz w:val="22"/>
+          <w:szCs w:val="22"/>
+          <w:lang w:val="uk-UA"/>
+        </w:rPr>
+        <w:t>}</w:t>
+      </w:r>
+    </w:p>
+    <w:p>
+      <w:pPr>
+        <w:tabs>
+          <w:tab w:val="left" w:pos="426"/>
+          <w:tab w:val="left" w:pos="4536"/>
+        </w:tabs>
+        <w:rPr>
+          <w:sz w:val="22"/>
+          <w:szCs w:val="22"/>
+          <w:lang w:val="uk-UA"/>
+        </w:rPr>
+      </w:pPr>
+      <w:r>
+        <w:rPr>
+          <w:sz w:val="22"/>
+          <w:szCs w:val="22"/>
           <w:lang w:val="uk-UA"/>
         </w:rPr>
         <w:t>13.</w:t>
       </w:r>
       <w:r>
         <w:rPr>
-          <w:sz w:val="24"/>
-          <w:szCs w:val="24"/>
+          <w:sz w:val="22"/>
+          <w:szCs w:val="22"/>
           <w:lang w:val="uk-UA"/>
         </w:rPr>
         <w:tab/>
@@ -1604,8 +2313,8 @@
       </w:r>
       <w:r>
         <w:rPr>
-          <w:sz w:val="24"/>
-          <w:szCs w:val="24"/>
+          <w:sz w:val="22"/>
+          <w:szCs w:val="22"/>
           <w:lang w:val="uk-UA"/>
         </w:rPr>
         <w:tab/>
@@ -1614,18 +2323,40 @@
         <w:rPr>
           <w:b/>
           <w:bCs/>
-          <w:sz w:val="24"/>
-          <w:szCs w:val="24"/>
-          <w:lang w:val="uk-UA"/>
-        </w:rPr>
-        <w:t>{next-certification-date}</w:t>
+          <w:sz w:val="22"/>
+          <w:szCs w:val="22"/>
+          <w:lang w:val="uk-UA"/>
+        </w:rPr>
+        <w:t>{</w:t>
+      </w:r>
+      <w:proofErr w:type="spellStart"/>
+      <w:r>
+        <w:rPr>
+          <w:b/>
+          <w:bCs/>
+          <w:sz w:val="22"/>
+          <w:szCs w:val="22"/>
+          <w:lang w:val="uk-UA"/>
+        </w:rPr>
+        <w:t>next-certification-date</w:t>
+      </w:r>
+      <w:proofErr w:type="spellEnd"/>
+      <w:r>
+        <w:rPr>
+          <w:b/>
+          <w:bCs/>
+          <w:sz w:val="22"/>
+          <w:szCs w:val="22"/>
+          <w:lang w:val="uk-UA"/>
+        </w:rPr>
+        <w:t>}</w:t>
       </w:r>
     </w:p>
     <w:p>
       <w:pPr>
         <w:rPr>
-          <w:sz w:val="24"/>
-          <w:szCs w:val="24"/>
+          <w:sz w:val="22"/>
+          <w:szCs w:val="22"/>
           <w:lang w:val="uk-UA"/>
         </w:rPr>
       </w:pPr>
@@ -1637,23 +2368,23 @@
           <w:tab w:val="left" w:pos="4253"/>
         </w:tabs>
         <w:rPr>
-          <w:sz w:val="24"/>
-          <w:szCs w:val="24"/>
-          <w:lang w:val="uk-UA"/>
-        </w:rPr>
-      </w:pPr>
-      <w:r>
-        <w:rPr>
-          <w:sz w:val="24"/>
-          <w:szCs w:val="24"/>
+          <w:sz w:val="22"/>
+          <w:szCs w:val="22"/>
+          <w:lang w:val="uk-UA"/>
+        </w:rPr>
+      </w:pPr>
+      <w:r>
+        <w:rPr>
+          <w:sz w:val="22"/>
+          <w:szCs w:val="22"/>
           <w:lang w:val="uk-UA"/>
         </w:rPr>
         <w:t>Голова комісії:</w:t>
       </w:r>
       <w:r>
         <w:rPr>
-          <w:sz w:val="24"/>
-          <w:szCs w:val="24"/>
+          <w:sz w:val="22"/>
+          <w:szCs w:val="22"/>
           <w:lang w:val="uk-UA"/>
         </w:rPr>
         <w:tab/>
@@ -1662,18 +2393,40 @@
         <w:rPr>
           <w:b/>
           <w:bCs/>
-          <w:sz w:val="24"/>
-          <w:szCs w:val="24"/>
-          <w:lang w:val="uk-UA"/>
-        </w:rPr>
-        <w:t>{chairperson}</w:t>
-      </w:r>
-      <w:r>
-        <w:rPr>
-          <w:b/>
-          <w:bCs/>
-          <w:sz w:val="24"/>
-          <w:szCs w:val="24"/>
+          <w:sz w:val="22"/>
+          <w:szCs w:val="22"/>
+          <w:lang w:val="uk-UA"/>
+        </w:rPr>
+        <w:t>{</w:t>
+      </w:r>
+      <w:proofErr w:type="spellStart"/>
+      <w:r>
+        <w:rPr>
+          <w:b/>
+          <w:bCs/>
+          <w:sz w:val="22"/>
+          <w:szCs w:val="22"/>
+          <w:lang w:val="uk-UA"/>
+        </w:rPr>
+        <w:t>chairperson</w:t>
+      </w:r>
+      <w:proofErr w:type="spellEnd"/>
+      <w:r>
+        <w:rPr>
+          <w:b/>
+          <w:bCs/>
+          <w:sz w:val="22"/>
+          <w:szCs w:val="22"/>
+          <w:lang w:val="uk-UA"/>
+        </w:rPr>
+        <w:t>}</w:t>
+      </w:r>
+      <w:r>
+        <w:rPr>
+          <w:b/>
+          <w:bCs/>
+          <w:sz w:val="22"/>
+          <w:szCs w:val="22"/>
           <w:lang w:val="uk-UA"/>
         </w:rPr>
         <w:tab/>
@@ -1687,23 +2440,23 @@
           <w:tab w:val="left" w:pos="4253"/>
         </w:tabs>
         <w:rPr>
-          <w:sz w:val="24"/>
-          <w:szCs w:val="24"/>
-          <w:lang w:val="uk-UA"/>
-        </w:rPr>
-      </w:pPr>
-      <w:r>
-        <w:rPr>
-          <w:sz w:val="24"/>
-          <w:szCs w:val="24"/>
+          <w:sz w:val="22"/>
+          <w:szCs w:val="22"/>
+          <w:lang w:val="uk-UA"/>
+        </w:rPr>
+      </w:pPr>
+      <w:r>
+        <w:rPr>
+          <w:sz w:val="22"/>
+          <w:szCs w:val="22"/>
           <w:lang w:val="uk-UA"/>
         </w:rPr>
         <w:t>Члени  комісії:</w:t>
       </w:r>
       <w:r>
         <w:rPr>
-          <w:sz w:val="24"/>
-          <w:szCs w:val="24"/>
+          <w:sz w:val="22"/>
+          <w:szCs w:val="22"/>
           <w:lang w:val="uk-UA"/>
         </w:rPr>
         <w:tab/>
@@ -1712,76 +2465,160 @@
     <w:p>
       <w:pPr>
         <w:tabs>
-          <w:tab w:val="left" w:pos="1843"/>
           <w:tab w:val="left" w:pos="4253"/>
         </w:tabs>
-        <w:rPr>
-          <w:b/>
-          <w:bCs/>
-          <w:sz w:val="24"/>
-          <w:szCs w:val="24"/>
-          <w:lang w:val="uk-UA"/>
-        </w:rPr>
-      </w:pPr>
-      <w:r>
-        <w:rPr>
-          <w:b/>
-          <w:bCs/>
-          <w:sz w:val="24"/>
-          <w:szCs w:val="24"/>
+        <w:ind w:firstLine="1843"/>
+        <w:rPr>
+          <w:b/>
+          <w:bCs/>
+          <w:sz w:val="22"/>
+          <w:szCs w:val="22"/>
           <w:lang w:val="en-US"/>
         </w:rPr>
+      </w:pPr>
+      <w:r>
+        <w:rPr>
+          <w:b/>
+          <w:bCs/>
+          <w:sz w:val="22"/>
+          <w:szCs w:val="22"/>
+          <w:lang w:val="uk-UA"/>
+        </w:rPr>
+        <w:t>{#</w:t>
+      </w:r>
+      <w:proofErr w:type="spellStart"/>
+      <w:r>
+        <w:rPr>
+          <w:b/>
+          <w:bCs/>
+          <w:sz w:val="22"/>
+          <w:szCs w:val="22"/>
+        </w:rPr>
+        <w:t>commissionItems</w:t>
+      </w:r>
+      <w:proofErr w:type="spellEnd"/>
+      <w:r>
+        <w:rPr>
+          <w:b/>
+          <w:bCs/>
+          <w:sz w:val="22"/>
+          <w:szCs w:val="22"/>
+          <w:lang w:val="uk-UA"/>
+        </w:rPr>
+        <w:t>}</w:t>
+      </w:r>
+    </w:p>
+    <w:p>
+      <w:pPr>
+        <w:tabs>
+          <w:tab w:val="left" w:pos="4253"/>
+        </w:tabs>
+        <w:ind w:firstLine="1843"/>
+        <w:rPr>
+          <w:b/>
+          <w:bCs/>
+          <w:sz w:val="22"/>
+          <w:szCs w:val="22"/>
+          <w:lang w:val="en-US"/>
+        </w:rPr>
+      </w:pPr>
+      <w:r>
+        <w:rPr>
+          <w:b/>
+          <w:bCs/>
+          <w:sz w:val="22"/>
+          <w:szCs w:val="22"/>
+          <w:lang w:val="uk-UA"/>
+        </w:rPr>
+        <w:t>{</w:t>
+      </w:r>
+      <w:proofErr w:type="spellStart"/>
+      <w:r>
+        <w:rPr>
+          <w:b/>
+          <w:bCs/>
+          <w:sz w:val="22"/>
+          <w:szCs w:val="22"/>
+          <w:lang w:val="uk-UA"/>
+        </w:rPr>
+        <w:t>member</w:t>
+      </w:r>
+      <w:proofErr w:type="spellEnd"/>
+      <w:r>
+        <w:rPr>
+          <w:b/>
+          <w:bCs/>
+          <w:sz w:val="22"/>
+          <w:szCs w:val="22"/>
+          <w:lang w:val="uk-UA"/>
+        </w:rPr>
+        <w:t xml:space="preserve">} </w:t>
+      </w:r>
+      <w:r>
+        <w:rPr>
+          <w:b/>
+          <w:bCs/>
+          <w:sz w:val="22"/>
+          <w:szCs w:val="22"/>
+          <w:lang w:val="en-US"/>
+        </w:rPr>
         <w:tab/>
       </w:r>
       <w:r>
         <w:rPr>
           <w:b/>
           <w:bCs/>
-          <w:sz w:val="24"/>
-          <w:szCs w:val="24"/>
-          <w:lang w:val="uk-UA"/>
-        </w:rPr>
-        <w:t>{#items}</w:t>
-      </w:r>
-      <w:r>
-        <w:rPr>
-          <w:b/>
-          <w:bCs/>
-          <w:sz w:val="24"/>
-          <w:szCs w:val="24"/>
-          <w:lang w:val="uk-UA"/>
-        </w:rPr>
-        <w:t xml:space="preserve">{member-1} </w:t>
-      </w:r>
-      <w:r>
-        <w:rPr>
-          <w:b/>
-          <w:bCs/>
-          <w:sz w:val="24"/>
-          <w:szCs w:val="24"/>
-          <w:lang w:val="en-US"/>
-        </w:rPr>
-        <w:tab/>
-      </w:r>
-      <w:r>
-        <w:rPr>
-          <w:b/>
-          <w:bCs/>
-          <w:sz w:val="24"/>
-          <w:szCs w:val="24"/>
+          <w:sz w:val="22"/>
+          <w:szCs w:val="22"/>
           <w:lang w:val="uk-UA"/>
         </w:rPr>
         <w:t>_________</w:t>
       </w:r>
-      <w:r>
-        <w:rPr>
-          <w:b/>
-          <w:bCs/>
-          <w:sz w:val="24"/>
-          <w:szCs w:val="24"/>
-          <w:lang w:val="uk-UA"/>
-        </w:rPr>
-        <w:t>{/items}</w:t>
+    </w:p>
+    <w:p>
+      <w:pPr>
+        <w:tabs>
+          <w:tab w:val="left" w:pos="4253"/>
+        </w:tabs>
+        <w:ind w:firstLine="1843"/>
+        <w:rPr>
+          <w:b/>
+          <w:bCs/>
+          <w:sz w:val="22"/>
+          <w:szCs w:val="22"/>
+          <w:lang w:val="uk-UA"/>
+        </w:rPr>
+      </w:pPr>
+      <w:r>
+        <w:rPr>
+          <w:b/>
+          <w:bCs/>
+          <w:sz w:val="22"/>
+          <w:szCs w:val="22"/>
+          <w:lang w:val="uk-UA"/>
+        </w:rPr>
+        <w:t>{/</w:t>
+      </w:r>
+      <w:proofErr w:type="spellStart"/>
+      <w:r>
+        <w:rPr>
+          <w:b/>
+          <w:bCs/>
+          <w:sz w:val="22"/>
+          <w:szCs w:val="22"/>
+        </w:rPr>
+        <w:t>commissionItems</w:t>
+      </w:r>
+      <w:proofErr w:type="spellEnd"/>
+      <w:r>
+        <w:rPr>
+          <w:b/>
+          <w:bCs/>
+          <w:sz w:val="22"/>
+          <w:szCs w:val="22"/>
+          <w:lang w:val="uk-UA"/>
+        </w:rPr>
+        <w:t>}</w:t>
       </w:r>
     </w:p>
     <w:sectPr>
@@ -2831,15 +3668,6 @@
   </w:num>
   <w:num w:numId="2" w16cid:durableId="99104320">
     <w:abstractNumId w:val="2"/>
-    <w:lvlOverride w:ilvl="0"/>
-    <w:lvlOverride w:ilvl="1"/>
-    <w:lvlOverride w:ilvl="2"/>
-    <w:lvlOverride w:ilvl="3"/>
-    <w:lvlOverride w:ilvl="4"/>
-    <w:lvlOverride w:ilvl="5"/>
-    <w:lvlOverride w:ilvl="6"/>
-    <w:lvlOverride w:ilvl="7"/>
-    <w:lvlOverride w:ilvl="8"/>
   </w:num>
   <w:num w:numId="3" w16cid:durableId="1655180889">
     <w:abstractNumId w:val="2"/>
@@ -3281,11 +4109,15 @@
   </w:style>
   <w:style w:type="character" w:default="1" w:styleId="DefaultParagraphFont">
     <w:name w:val="Default Paragraph Font"/>
+    <w:uiPriority w:val="1"/>
     <w:semiHidden/>
+    <w:unhideWhenUsed/>
   </w:style>
   <w:style w:type="table" w:default="1" w:styleId="TableNormal">
     <w:name w:val="Normal Table"/>
+    <w:uiPriority w:val="99"/>
     <w:semiHidden/>
+    <w:unhideWhenUsed/>
     <w:tblPr>
       <w:tblInd w:w="0" w:type="dxa"/>
       <w:tblCellMar>
@@ -3298,7 +4130,9 @@
   </w:style>
   <w:style w:type="numbering" w:default="1" w:styleId="NoList">
     <w:name w:val="No List"/>
+    <w:uiPriority w:val="99"/>
     <w:semiHidden/>
+    <w:unhideWhenUsed/>
   </w:style>
   <w:style w:type="paragraph" w:customStyle="1" w:styleId="Normal1">
     <w:name w:val="Normal1"/>

</xml_diff>